<commit_message>
Add clinic database clsses with keys + enum classes. Add ApplicationDbContextFactory.cs for EF Core design-time migrations. Migration + database update. Update documents.
</commit_message>
<xml_diff>
--- a/docs/Martmaa_Invoice_model.docx
+++ b/docs/Martmaa_Invoice_model.docx
@@ -583,6 +583,7 @@
                 <w:szCs w:val="24"/>
               </w:rPr>
             </w:pPr>
+            <w:proofErr w:type="spellStart"/>
             <w:r>
               <w:rPr>
                 <w:rFonts w:ascii="Calibri" w:hAnsi="Calibri" w:cs="Calibri"/>
@@ -591,6 +592,15 @@
               </w:rPr>
               <w:t>Password</w:t>
             </w:r>
+            <w:r>
+              <w:rPr>
+                <w:rFonts w:ascii="Calibri" w:hAnsi="Calibri" w:cs="Calibri"/>
+                <w:sz w:val="24"/>
+                <w:szCs w:val="24"/>
+              </w:rPr>
+              <w:t>Hash</w:t>
+            </w:r>
+            <w:proofErr w:type="spellEnd"/>
           </w:p>
         </w:tc>
         <w:tc>
@@ -1665,8 +1675,6 @@
               </w:rPr>
               <w:t>+</w:t>
             </w:r>
-            <w:bookmarkStart w:id="0" w:name="_GoBack"/>
-            <w:bookmarkEnd w:id="0"/>
           </w:p>
         </w:tc>
         <w:tc>
@@ -3581,7 +3589,6 @@
                 <w:szCs w:val="24"/>
               </w:rPr>
             </w:pPr>
-            <w:proofErr w:type="spellStart"/>
             <w:r>
               <w:rPr>
                 <w:rFonts w:ascii="Calibri" w:hAnsi="Calibri" w:cs="Calibri"/>
@@ -3591,7 +3598,6 @@
               </w:rPr>
               <w:t>AppointmentStatus</w:t>
             </w:r>
-            <w:proofErr w:type="spellEnd"/>
           </w:p>
         </w:tc>
         <w:tc>
@@ -7341,6 +7347,1653 @@
         </w:rPr>
       </w:pPr>
     </w:p>
+    <w:tbl>
+      <w:tblPr>
+        <w:tblStyle w:val="TableGrid"/>
+        <w:tblW w:w="0" w:type="auto"/>
+        <w:tblLook w:val="04A0" w:firstRow="1" w:lastRow="0" w:firstColumn="1" w:lastColumn="0" w:noHBand="0" w:noVBand="1"/>
+      </w:tblPr>
+      <w:tblGrid>
+        <w:gridCol w:w="9330"/>
+      </w:tblGrid>
+      <w:tr>
+        <w:tc>
+          <w:tcPr>
+            <w:tcW w:w="9330" w:type="dxa"/>
+            <w:tcBorders>
+              <w:top w:val="single" w:sz="12" w:space="0" w:color="auto"/>
+              <w:left w:val="single" w:sz="12" w:space="0" w:color="auto"/>
+              <w:bottom w:val="single" w:sz="12" w:space="0" w:color="auto"/>
+              <w:right w:val="single" w:sz="12" w:space="0" w:color="auto"/>
+            </w:tcBorders>
+            <w:shd w:val="clear" w:color="auto" w:fill="92D050"/>
+          </w:tcPr>
+          <w:p>
+            <w:pPr>
+              <w:jc w:val="center"/>
+              <w:rPr>
+                <w:rFonts w:ascii="Calibri" w:hAnsi="Calibri" w:cs="Calibri"/>
+                <w:b/>
+                <w:sz w:val="24"/>
+                <w:szCs w:val="24"/>
+              </w:rPr>
+            </w:pPr>
+            <w:r>
+              <w:rPr>
+                <w:rFonts w:ascii="Calibri" w:hAnsi="Calibri" w:cs="Calibri"/>
+                <w:b/>
+                <w:sz w:val="24"/>
+                <w:szCs w:val="24"/>
+              </w:rPr>
+              <w:t>ENUMS</w:t>
+            </w:r>
+          </w:p>
+        </w:tc>
+      </w:tr>
+      <w:tr>
+        <w:tc>
+          <w:tcPr>
+            <w:tcW w:w="9330" w:type="dxa"/>
+            <w:tcBorders>
+              <w:top w:val="single" w:sz="12" w:space="0" w:color="auto"/>
+              <w:left w:val="single" w:sz="12" w:space="0" w:color="auto"/>
+              <w:bottom w:val="single" w:sz="12" w:space="0" w:color="auto"/>
+              <w:right w:val="single" w:sz="12" w:space="0" w:color="auto"/>
+            </w:tcBorders>
+            <w:shd w:val="clear" w:color="auto" w:fill="D9D9D9" w:themeFill="background1" w:themeFillShade="D9"/>
+          </w:tcPr>
+          <w:p>
+            <w:pPr>
+              <w:tabs>
+                <w:tab w:val="center" w:pos="4567"/>
+                <w:tab w:val="left" w:pos="5880"/>
+              </w:tabs>
+              <w:rPr>
+                <w:rFonts w:ascii="Calibri" w:hAnsi="Calibri" w:cs="Calibri"/>
+                <w:b/>
+                <w:sz w:val="24"/>
+                <w:szCs w:val="24"/>
+              </w:rPr>
+            </w:pPr>
+            <w:r>
+              <w:rPr>
+                <w:rFonts w:ascii="Calibri" w:hAnsi="Calibri" w:cs="Calibri"/>
+                <w:b/>
+                <w:sz w:val="24"/>
+                <w:szCs w:val="24"/>
+              </w:rPr>
+              <w:tab/>
+            </w:r>
+            <w:proofErr w:type="spellStart"/>
+            <w:r>
+              <w:rPr>
+                <w:rFonts w:ascii="Calibri" w:hAnsi="Calibri" w:cs="Calibri"/>
+                <w:b/>
+                <w:sz w:val="24"/>
+                <w:szCs w:val="24"/>
+              </w:rPr>
+              <w:t>User</w:t>
+            </w:r>
+            <w:r>
+              <w:rPr>
+                <w:rFonts w:ascii="Calibri" w:hAnsi="Calibri" w:cs="Calibri"/>
+                <w:b/>
+                <w:sz w:val="24"/>
+                <w:szCs w:val="24"/>
+              </w:rPr>
+              <w:t>Role</w:t>
+            </w:r>
+            <w:proofErr w:type="spellEnd"/>
+            <w:r>
+              <w:rPr>
+                <w:rFonts w:ascii="Calibri" w:hAnsi="Calibri" w:cs="Calibri"/>
+                <w:b/>
+                <w:sz w:val="24"/>
+                <w:szCs w:val="24"/>
+              </w:rPr>
+              <w:tab/>
+            </w:r>
+          </w:p>
+        </w:tc>
+      </w:tr>
+      <w:tr>
+        <w:tc>
+          <w:tcPr>
+            <w:tcW w:w="9330" w:type="dxa"/>
+            <w:tcBorders>
+              <w:top w:val="single" w:sz="12" w:space="0" w:color="auto"/>
+              <w:left w:val="single" w:sz="12" w:space="0" w:color="auto"/>
+              <w:right w:val="single" w:sz="12" w:space="0" w:color="auto"/>
+            </w:tcBorders>
+          </w:tcPr>
+          <w:p>
+            <w:pPr>
+              <w:rPr>
+                <w:rFonts w:ascii="Calibri" w:hAnsi="Calibri" w:cs="Calibri"/>
+                <w:sz w:val="24"/>
+                <w:szCs w:val="24"/>
+              </w:rPr>
+            </w:pPr>
+            <w:r>
+              <w:rPr>
+                <w:rFonts w:ascii="Calibri" w:hAnsi="Calibri" w:cs="Calibri"/>
+                <w:sz w:val="24"/>
+                <w:szCs w:val="24"/>
+              </w:rPr>
+              <w:t>Client</w:t>
+            </w:r>
+          </w:p>
+        </w:tc>
+      </w:tr>
+      <w:tr>
+        <w:tc>
+          <w:tcPr>
+            <w:tcW w:w="9330" w:type="dxa"/>
+            <w:tcBorders>
+              <w:left w:val="single" w:sz="12" w:space="0" w:color="auto"/>
+              <w:right w:val="single" w:sz="12" w:space="0" w:color="auto"/>
+            </w:tcBorders>
+          </w:tcPr>
+          <w:p>
+            <w:pPr>
+              <w:rPr>
+                <w:rFonts w:ascii="Calibri" w:hAnsi="Calibri" w:cs="Calibri"/>
+                <w:sz w:val="24"/>
+                <w:szCs w:val="24"/>
+              </w:rPr>
+            </w:pPr>
+            <w:r>
+              <w:rPr>
+                <w:rFonts w:ascii="Calibri" w:hAnsi="Calibri" w:cs="Calibri"/>
+                <w:sz w:val="24"/>
+                <w:szCs w:val="24"/>
+              </w:rPr>
+              <w:t>Doctor</w:t>
+            </w:r>
+          </w:p>
+        </w:tc>
+      </w:tr>
+      <w:tr>
+        <w:tc>
+          <w:tcPr>
+            <w:tcW w:w="9330" w:type="dxa"/>
+            <w:tcBorders>
+              <w:left w:val="single" w:sz="12" w:space="0" w:color="auto"/>
+              <w:right w:val="single" w:sz="12" w:space="0" w:color="auto"/>
+            </w:tcBorders>
+          </w:tcPr>
+          <w:p>
+            <w:pPr>
+              <w:rPr>
+                <w:rFonts w:ascii="Calibri" w:hAnsi="Calibri" w:cs="Calibri"/>
+                <w:sz w:val="24"/>
+                <w:szCs w:val="24"/>
+              </w:rPr>
+            </w:pPr>
+            <w:r>
+              <w:rPr>
+                <w:rFonts w:ascii="Calibri" w:hAnsi="Calibri" w:cs="Calibri"/>
+                <w:sz w:val="24"/>
+                <w:szCs w:val="24"/>
+              </w:rPr>
+              <w:t>Administrator</w:t>
+            </w:r>
+          </w:p>
+        </w:tc>
+      </w:tr>
+      <w:tr>
+        <w:tc>
+          <w:tcPr>
+            <w:tcW w:w="9330" w:type="dxa"/>
+            <w:tcBorders>
+              <w:top w:val="single" w:sz="12" w:space="0" w:color="auto"/>
+              <w:left w:val="single" w:sz="12" w:space="0" w:color="auto"/>
+              <w:bottom w:val="single" w:sz="12" w:space="0" w:color="auto"/>
+              <w:right w:val="single" w:sz="12" w:space="0" w:color="auto"/>
+            </w:tcBorders>
+            <w:shd w:val="clear" w:color="auto" w:fill="D9D9D9" w:themeFill="background1" w:themeFillShade="D9"/>
+          </w:tcPr>
+          <w:p>
+            <w:pPr>
+              <w:tabs>
+                <w:tab w:val="left" w:pos="3375"/>
+                <w:tab w:val="center" w:pos="4567"/>
+                <w:tab w:val="left" w:pos="5730"/>
+              </w:tabs>
+              <w:rPr>
+                <w:rFonts w:ascii="Calibri" w:hAnsi="Calibri" w:cs="Calibri"/>
+                <w:b/>
+                <w:sz w:val="24"/>
+                <w:szCs w:val="24"/>
+              </w:rPr>
+            </w:pPr>
+            <w:r>
+              <w:rPr>
+                <w:rFonts w:ascii="Calibri" w:hAnsi="Calibri" w:cs="Calibri"/>
+                <w:b/>
+                <w:sz w:val="24"/>
+                <w:szCs w:val="24"/>
+              </w:rPr>
+              <w:tab/>
+            </w:r>
+            <w:r>
+              <w:rPr>
+                <w:rFonts w:ascii="Calibri" w:hAnsi="Calibri" w:cs="Calibri"/>
+                <w:b/>
+                <w:sz w:val="24"/>
+                <w:szCs w:val="24"/>
+              </w:rPr>
+              <w:tab/>
+            </w:r>
+            <w:proofErr w:type="spellStart"/>
+            <w:r>
+              <w:rPr>
+                <w:rFonts w:ascii="Calibri" w:hAnsi="Calibri" w:cs="Calibri"/>
+                <w:b/>
+                <w:sz w:val="24"/>
+                <w:szCs w:val="24"/>
+              </w:rPr>
+              <w:t>AppointmentStatus</w:t>
+            </w:r>
+            <w:proofErr w:type="spellEnd"/>
+            <w:r>
+              <w:rPr>
+                <w:rFonts w:ascii="Calibri" w:hAnsi="Calibri" w:cs="Calibri"/>
+                <w:b/>
+                <w:sz w:val="24"/>
+                <w:szCs w:val="24"/>
+              </w:rPr>
+              <w:tab/>
+            </w:r>
+          </w:p>
+        </w:tc>
+      </w:tr>
+      <w:tr>
+        <w:tc>
+          <w:tcPr>
+            <w:tcW w:w="9330" w:type="dxa"/>
+            <w:tcBorders>
+              <w:top w:val="single" w:sz="12" w:space="0" w:color="auto"/>
+              <w:left w:val="single" w:sz="12" w:space="0" w:color="auto"/>
+              <w:right w:val="single" w:sz="12" w:space="0" w:color="auto"/>
+            </w:tcBorders>
+          </w:tcPr>
+          <w:p>
+            <w:pPr>
+              <w:rPr>
+                <w:rFonts w:ascii="Calibri" w:hAnsi="Calibri" w:cs="Calibri"/>
+                <w:sz w:val="24"/>
+                <w:szCs w:val="24"/>
+              </w:rPr>
+            </w:pPr>
+            <w:r>
+              <w:rPr>
+                <w:rFonts w:ascii="Calibri" w:hAnsi="Calibri" w:cs="Calibri"/>
+                <w:sz w:val="24"/>
+                <w:szCs w:val="24"/>
+              </w:rPr>
+              <w:t>Scheduled</w:t>
+            </w:r>
+          </w:p>
+        </w:tc>
+      </w:tr>
+      <w:tr>
+        <w:tc>
+          <w:tcPr>
+            <w:tcW w:w="9330" w:type="dxa"/>
+            <w:tcBorders>
+              <w:left w:val="single" w:sz="12" w:space="0" w:color="auto"/>
+              <w:right w:val="single" w:sz="12" w:space="0" w:color="auto"/>
+            </w:tcBorders>
+          </w:tcPr>
+          <w:p>
+            <w:pPr>
+              <w:rPr>
+                <w:rFonts w:ascii="Calibri" w:hAnsi="Calibri" w:cs="Calibri"/>
+                <w:sz w:val="24"/>
+                <w:szCs w:val="24"/>
+              </w:rPr>
+            </w:pPr>
+            <w:r>
+              <w:rPr>
+                <w:rFonts w:ascii="Calibri" w:hAnsi="Calibri" w:cs="Calibri"/>
+                <w:sz w:val="24"/>
+                <w:szCs w:val="24"/>
+              </w:rPr>
+              <w:t>Completed</w:t>
+            </w:r>
+          </w:p>
+        </w:tc>
+      </w:tr>
+      <w:tr>
+        <w:tc>
+          <w:tcPr>
+            <w:tcW w:w="9330" w:type="dxa"/>
+            <w:tcBorders>
+              <w:left w:val="single" w:sz="12" w:space="0" w:color="auto"/>
+              <w:right w:val="single" w:sz="12" w:space="0" w:color="auto"/>
+            </w:tcBorders>
+          </w:tcPr>
+          <w:p>
+            <w:pPr>
+              <w:rPr>
+                <w:rFonts w:ascii="Calibri" w:hAnsi="Calibri" w:cs="Calibri"/>
+                <w:sz w:val="24"/>
+                <w:szCs w:val="24"/>
+              </w:rPr>
+            </w:pPr>
+            <w:r>
+              <w:rPr>
+                <w:rFonts w:ascii="Calibri" w:hAnsi="Calibri" w:cs="Calibri"/>
+                <w:sz w:val="24"/>
+                <w:szCs w:val="24"/>
+              </w:rPr>
+              <w:t>Cancelled</w:t>
+            </w:r>
+          </w:p>
+        </w:tc>
+      </w:tr>
+      <w:tr>
+        <w:tc>
+          <w:tcPr>
+            <w:tcW w:w="9330" w:type="dxa"/>
+            <w:tcBorders>
+              <w:left w:val="single" w:sz="12" w:space="0" w:color="auto"/>
+              <w:right w:val="single" w:sz="12" w:space="0" w:color="auto"/>
+            </w:tcBorders>
+          </w:tcPr>
+          <w:p>
+            <w:pPr>
+              <w:rPr>
+                <w:rFonts w:ascii="Calibri" w:hAnsi="Calibri" w:cs="Calibri"/>
+                <w:sz w:val="24"/>
+                <w:szCs w:val="24"/>
+              </w:rPr>
+            </w:pPr>
+            <w:proofErr w:type="spellStart"/>
+            <w:r>
+              <w:rPr>
+                <w:rFonts w:ascii="Calibri" w:hAnsi="Calibri" w:cs="Calibri"/>
+                <w:sz w:val="24"/>
+                <w:szCs w:val="24"/>
+              </w:rPr>
+              <w:t>NoShow</w:t>
+            </w:r>
+            <w:proofErr w:type="spellEnd"/>
+          </w:p>
+        </w:tc>
+      </w:tr>
+    </w:tbl>
+    <w:p>
+      <w:pPr>
+        <w:rPr>
+          <w:rFonts w:ascii="Calibri" w:hAnsi="Calibri" w:cs="Calibri"/>
+          <w:noProof/>
+          <w:sz w:val="24"/>
+          <w:szCs w:val="24"/>
+        </w:rPr>
+      </w:pPr>
+    </w:p>
+    <w:p>
+      <w:pPr>
+        <w:pStyle w:val="Title"/>
+        <w:rPr>
+          <w:noProof/>
+        </w:rPr>
+      </w:pPr>
+      <w:r>
+        <w:rPr>
+          <w:noProof/>
+        </w:rPr>
+        <w:lastRenderedPageBreak/>
+        <w:t>Reeglid</w:t>
+      </w:r>
+    </w:p>
+    <w:p>
+      <w:pPr>
+        <w:pStyle w:val="Heading1"/>
+        <w:rPr>
+          <w:noProof/>
+        </w:rPr>
+      </w:pPr>
+      <w:r>
+        <w:rPr>
+          <w:noProof/>
+        </w:rPr>
+        <w:t>Must have</w:t>
+      </w:r>
+    </w:p>
+    <w:p/>
+    <w:p>
+      <w:pPr>
+        <w:pStyle w:val="ListParagraph"/>
+        <w:numPr>
+          <w:ilvl w:val="0"/>
+          <w:numId w:val="1"/>
+        </w:numPr>
+      </w:pPr>
+      <w:proofErr w:type="spellStart"/>
+      <w:r>
+        <w:t>Arvel</w:t>
+      </w:r>
+      <w:proofErr w:type="spellEnd"/>
+      <w:r>
+        <w:t xml:space="preserve"> </w:t>
+      </w:r>
+      <w:proofErr w:type="spellStart"/>
+      <w:r>
+        <w:t>DueDate</w:t>
+      </w:r>
+      <w:proofErr w:type="spellEnd"/>
+      <w:r>
+        <w:t xml:space="preserve"> </w:t>
+      </w:r>
+      <w:proofErr w:type="spellStart"/>
+      <w:r>
+        <w:t>peab</w:t>
+      </w:r>
+      <w:proofErr w:type="spellEnd"/>
+      <w:r>
+        <w:t xml:space="preserve"> </w:t>
+      </w:r>
+      <w:proofErr w:type="spellStart"/>
+      <w:r>
+        <w:t>olema</w:t>
+      </w:r>
+      <w:proofErr w:type="spellEnd"/>
+      <w:r>
+        <w:t xml:space="preserve"> </w:t>
+      </w:r>
+      <w:proofErr w:type="spellStart"/>
+      <w:r>
+        <w:t>suurem</w:t>
+      </w:r>
+      <w:proofErr w:type="spellEnd"/>
+      <w:r>
+        <w:t xml:space="preserve"> </w:t>
+      </w:r>
+      <w:proofErr w:type="spellStart"/>
+      <w:r>
+        <w:t>ehk</w:t>
+      </w:r>
+      <w:proofErr w:type="spellEnd"/>
+      <w:r>
+        <w:t xml:space="preserve"> </w:t>
+      </w:r>
+      <w:proofErr w:type="spellStart"/>
+      <w:proofErr w:type="gramStart"/>
+      <w:r>
+        <w:t>peale</w:t>
+      </w:r>
+      <w:proofErr w:type="spellEnd"/>
+      <w:proofErr w:type="gramEnd"/>
+      <w:r>
+        <w:t xml:space="preserve"> </w:t>
+      </w:r>
+      <w:proofErr w:type="spellStart"/>
+      <w:r>
+        <w:t>InvoiceDate-i</w:t>
+      </w:r>
+      <w:proofErr w:type="spellEnd"/>
+      <w:r>
+        <w:t>.</w:t>
+      </w:r>
+    </w:p>
+    <w:p>
+      <w:pPr>
+        <w:pStyle w:val="ListParagraph"/>
+        <w:numPr>
+          <w:ilvl w:val="0"/>
+          <w:numId w:val="1"/>
+        </w:numPr>
+      </w:pPr>
+      <w:proofErr w:type="spellStart"/>
+      <w:r>
+        <w:t>Ei</w:t>
+      </w:r>
+      <w:proofErr w:type="spellEnd"/>
+      <w:r>
+        <w:t xml:space="preserve"> </w:t>
+      </w:r>
+      <w:proofErr w:type="spellStart"/>
+      <w:r>
+        <w:t>tohi</w:t>
+      </w:r>
+      <w:proofErr w:type="spellEnd"/>
+      <w:r>
+        <w:t xml:space="preserve"> olla </w:t>
+      </w:r>
+      <w:proofErr w:type="spellStart"/>
+      <w:r>
+        <w:t>topeltbroneeringudi</w:t>
+      </w:r>
+      <w:proofErr w:type="spellEnd"/>
+      <w:r>
+        <w:t xml:space="preserve"> </w:t>
+      </w:r>
+      <w:proofErr w:type="spellStart"/>
+      <w:r>
+        <w:t>ehk</w:t>
+      </w:r>
+      <w:proofErr w:type="spellEnd"/>
+      <w:r>
+        <w:t xml:space="preserve"> </w:t>
+      </w:r>
+      <w:proofErr w:type="spellStart"/>
+      <w:r>
+        <w:t>üks</w:t>
+      </w:r>
+      <w:proofErr w:type="spellEnd"/>
+      <w:r>
+        <w:t xml:space="preserve"> </w:t>
+      </w:r>
+      <w:proofErr w:type="spellStart"/>
+      <w:r>
+        <w:t>arst</w:t>
+      </w:r>
+      <w:proofErr w:type="spellEnd"/>
+      <w:r>
+        <w:t xml:space="preserve"> </w:t>
+      </w:r>
+      <w:proofErr w:type="gramStart"/>
+      <w:r>
+        <w:t>ja</w:t>
+      </w:r>
+      <w:proofErr w:type="gramEnd"/>
+      <w:r>
+        <w:t xml:space="preserve"> </w:t>
+      </w:r>
+      <w:proofErr w:type="spellStart"/>
+      <w:r>
+        <w:t>klient</w:t>
+      </w:r>
+      <w:proofErr w:type="spellEnd"/>
+      <w:r>
+        <w:t xml:space="preserve"> </w:t>
+      </w:r>
+      <w:proofErr w:type="spellStart"/>
+      <w:r>
+        <w:t>saab</w:t>
+      </w:r>
+      <w:proofErr w:type="spellEnd"/>
+      <w:r>
+        <w:t xml:space="preserve"> olla </w:t>
+      </w:r>
+      <w:proofErr w:type="spellStart"/>
+      <w:r>
+        <w:t>samal</w:t>
+      </w:r>
+      <w:proofErr w:type="spellEnd"/>
+      <w:r>
+        <w:t xml:space="preserve"> </w:t>
+      </w:r>
+      <w:proofErr w:type="spellStart"/>
+      <w:r>
+        <w:t>ajahetkel</w:t>
+      </w:r>
+      <w:proofErr w:type="spellEnd"/>
+      <w:r>
+        <w:t xml:space="preserve"> </w:t>
+      </w:r>
+      <w:proofErr w:type="spellStart"/>
+      <w:r>
+        <w:t>seotud</w:t>
+      </w:r>
+      <w:proofErr w:type="spellEnd"/>
+      <w:r>
+        <w:t xml:space="preserve"> </w:t>
+      </w:r>
+      <w:proofErr w:type="spellStart"/>
+      <w:r>
+        <w:t>ainult</w:t>
+      </w:r>
+      <w:proofErr w:type="spellEnd"/>
+      <w:r>
+        <w:t xml:space="preserve"> </w:t>
+      </w:r>
+      <w:proofErr w:type="spellStart"/>
+      <w:r>
+        <w:t>ühe</w:t>
+      </w:r>
+      <w:proofErr w:type="spellEnd"/>
+      <w:r>
+        <w:t xml:space="preserve"> </w:t>
+      </w:r>
+      <w:proofErr w:type="spellStart"/>
+      <w:r>
+        <w:t>broneeringuga</w:t>
+      </w:r>
+      <w:proofErr w:type="spellEnd"/>
+      <w:r>
+        <w:t>.</w:t>
+      </w:r>
+    </w:p>
+    <w:p>
+      <w:pPr>
+        <w:pStyle w:val="ListParagraph"/>
+        <w:numPr>
+          <w:ilvl w:val="0"/>
+          <w:numId w:val="1"/>
+        </w:numPr>
+      </w:pPr>
+      <w:proofErr w:type="spellStart"/>
+      <w:r>
+        <w:t>Arvel</w:t>
+      </w:r>
+      <w:proofErr w:type="spellEnd"/>
+      <w:r>
+        <w:t xml:space="preserve"> </w:t>
+      </w:r>
+      <w:proofErr w:type="spellStart"/>
+      <w:r>
+        <w:t>TotalWithVat</w:t>
+      </w:r>
+      <w:proofErr w:type="spellEnd"/>
+      <w:r>
+        <w:t xml:space="preserve"> </w:t>
+      </w:r>
+      <w:proofErr w:type="spellStart"/>
+      <w:r>
+        <w:t>peab</w:t>
+      </w:r>
+      <w:proofErr w:type="spellEnd"/>
+      <w:r>
+        <w:t xml:space="preserve"> </w:t>
+      </w:r>
+      <w:proofErr w:type="spellStart"/>
+      <w:r>
+        <w:t>olema</w:t>
+      </w:r>
+      <w:proofErr w:type="spellEnd"/>
+      <w:r>
+        <w:t xml:space="preserve"> </w:t>
+      </w:r>
+      <w:proofErr w:type="spellStart"/>
+      <w:r>
+        <w:t>suurem</w:t>
+      </w:r>
+      <w:proofErr w:type="spellEnd"/>
+      <w:r>
+        <w:t xml:space="preserve"> </w:t>
+      </w:r>
+      <w:proofErr w:type="spellStart"/>
+      <w:r>
+        <w:t>kui</w:t>
+      </w:r>
+      <w:proofErr w:type="spellEnd"/>
+      <w:r>
+        <w:t xml:space="preserve"> </w:t>
+      </w:r>
+      <w:proofErr w:type="spellStart"/>
+      <w:r>
+        <w:t>TotalBeforeVat</w:t>
+      </w:r>
+      <w:proofErr w:type="spellEnd"/>
+      <w:r>
+        <w:t xml:space="preserve"> (Vat-</w:t>
+      </w:r>
+      <w:proofErr w:type="spellStart"/>
+      <w:r>
+        <w:t>i</w:t>
+      </w:r>
+      <w:proofErr w:type="spellEnd"/>
+      <w:r>
+        <w:t xml:space="preserve"> </w:t>
+      </w:r>
+      <w:proofErr w:type="spellStart"/>
+      <w:proofErr w:type="gramStart"/>
+      <w:r>
+        <w:t>saab</w:t>
+      </w:r>
+      <w:proofErr w:type="spellEnd"/>
+      <w:proofErr w:type="gramEnd"/>
+      <w:r>
+        <w:t xml:space="preserve"> </w:t>
+      </w:r>
+      <w:proofErr w:type="spellStart"/>
+      <w:r>
+        <w:t>määrata</w:t>
+      </w:r>
+      <w:proofErr w:type="spellEnd"/>
+      <w:r>
+        <w:t xml:space="preserve"> </w:t>
+      </w:r>
+      <w:proofErr w:type="spellStart"/>
+      <w:r>
+        <w:t>konstantse</w:t>
+      </w:r>
+      <w:proofErr w:type="spellEnd"/>
+      <w:r>
+        <w:t xml:space="preserve"> </w:t>
+      </w:r>
+      <w:proofErr w:type="spellStart"/>
+      <w:r>
+        <w:t>suurusena</w:t>
+      </w:r>
+      <w:proofErr w:type="spellEnd"/>
+      <w:r>
+        <w:t>)</w:t>
+      </w:r>
+      <w:r>
+        <w:t>.</w:t>
+      </w:r>
+    </w:p>
+    <w:p>
+      <w:pPr>
+        <w:pStyle w:val="ListParagraph"/>
+        <w:numPr>
+          <w:ilvl w:val="0"/>
+          <w:numId w:val="1"/>
+        </w:numPr>
+      </w:pPr>
+      <w:proofErr w:type="spellStart"/>
+      <w:r>
+        <w:t>Makstud</w:t>
+      </w:r>
+      <w:proofErr w:type="spellEnd"/>
+      <w:r>
+        <w:t xml:space="preserve"> </w:t>
+      </w:r>
+      <w:proofErr w:type="spellStart"/>
+      <w:r>
+        <w:t>arvet</w:t>
+      </w:r>
+      <w:proofErr w:type="spellEnd"/>
+      <w:r>
+        <w:t xml:space="preserve"> </w:t>
+      </w:r>
+      <w:proofErr w:type="spellStart"/>
+      <w:r>
+        <w:t>ei</w:t>
+      </w:r>
+      <w:proofErr w:type="spellEnd"/>
+      <w:r>
+        <w:t xml:space="preserve"> </w:t>
+      </w:r>
+      <w:proofErr w:type="spellStart"/>
+      <w:r>
+        <w:t>saa</w:t>
+      </w:r>
+      <w:proofErr w:type="spellEnd"/>
+      <w:r>
+        <w:t xml:space="preserve"> </w:t>
+      </w:r>
+      <w:proofErr w:type="spellStart"/>
+      <w:r>
+        <w:t>muuta</w:t>
+      </w:r>
+      <w:proofErr w:type="spellEnd"/>
+      <w:r>
+        <w:t>.</w:t>
+      </w:r>
+    </w:p>
+    <w:p>
+      <w:pPr>
+        <w:pStyle w:val="ListParagraph"/>
+        <w:numPr>
+          <w:ilvl w:val="0"/>
+          <w:numId w:val="1"/>
+        </w:numPr>
+      </w:pPr>
+      <w:proofErr w:type="spellStart"/>
+      <w:r>
+        <w:t>Broneeringul</w:t>
+      </w:r>
+      <w:proofErr w:type="spellEnd"/>
+      <w:r>
+        <w:t xml:space="preserve"> </w:t>
+      </w:r>
+      <w:proofErr w:type="spellStart"/>
+      <w:r>
+        <w:t>kindel</w:t>
+      </w:r>
+      <w:proofErr w:type="spellEnd"/>
+      <w:r>
+        <w:t xml:space="preserve"> default </w:t>
+      </w:r>
+      <w:proofErr w:type="spellStart"/>
+      <w:r>
+        <w:t>kestvus</w:t>
+      </w:r>
+      <w:proofErr w:type="spellEnd"/>
+      <w:r>
+        <w:t xml:space="preserve">, </w:t>
+      </w:r>
+      <w:proofErr w:type="spellStart"/>
+      <w:r>
+        <w:t>hetkel</w:t>
+      </w:r>
+      <w:proofErr w:type="spellEnd"/>
+      <w:r>
+        <w:t xml:space="preserve"> 30min</w:t>
+      </w:r>
+      <w:r>
+        <w:t xml:space="preserve">. </w:t>
+      </w:r>
+      <w:proofErr w:type="spellStart"/>
+      <w:r>
+        <w:t>Broneeringu</w:t>
+      </w:r>
+      <w:proofErr w:type="spellEnd"/>
+      <w:r>
+        <w:t xml:space="preserve"> </w:t>
+      </w:r>
+      <w:proofErr w:type="spellStart"/>
+      <w:r>
+        <w:t>kestvust</w:t>
+      </w:r>
+      <w:proofErr w:type="spellEnd"/>
+      <w:r>
+        <w:t xml:space="preserve"> </w:t>
+      </w:r>
+      <w:proofErr w:type="spellStart"/>
+      <w:proofErr w:type="gramStart"/>
+      <w:r>
+        <w:t>saab</w:t>
+      </w:r>
+      <w:proofErr w:type="spellEnd"/>
+      <w:proofErr w:type="gramEnd"/>
+      <w:r>
+        <w:t xml:space="preserve"> </w:t>
+      </w:r>
+      <w:proofErr w:type="spellStart"/>
+      <w:r>
+        <w:t>pikemaks</w:t>
+      </w:r>
+      <w:proofErr w:type="spellEnd"/>
+      <w:r>
+        <w:t xml:space="preserve"> </w:t>
+      </w:r>
+      <w:proofErr w:type="spellStart"/>
+      <w:r>
+        <w:t>muuta</w:t>
+      </w:r>
+      <w:proofErr w:type="spellEnd"/>
+      <w:r>
+        <w:t xml:space="preserve"> </w:t>
+      </w:r>
+      <w:proofErr w:type="spellStart"/>
+      <w:r>
+        <w:t>vaid</w:t>
+      </w:r>
+      <w:proofErr w:type="spellEnd"/>
+      <w:r>
+        <w:t xml:space="preserve"> administrator ja </w:t>
+      </w:r>
+      <w:proofErr w:type="spellStart"/>
+      <w:r>
+        <w:t>seda</w:t>
+      </w:r>
+      <w:proofErr w:type="spellEnd"/>
+      <w:r>
+        <w:t xml:space="preserve"> </w:t>
+      </w:r>
+      <w:proofErr w:type="spellStart"/>
+      <w:r>
+        <w:t>järgnevate</w:t>
+      </w:r>
+      <w:proofErr w:type="spellEnd"/>
+      <w:r>
+        <w:t xml:space="preserve"> </w:t>
+      </w:r>
+      <w:proofErr w:type="spellStart"/>
+      <w:r>
+        <w:t>aegade</w:t>
+      </w:r>
+      <w:proofErr w:type="spellEnd"/>
+      <w:r>
+        <w:t xml:space="preserve"> </w:t>
+      </w:r>
+      <w:proofErr w:type="spellStart"/>
+      <w:r>
+        <w:t>arvelt</w:t>
+      </w:r>
+      <w:proofErr w:type="spellEnd"/>
+      <w:r>
+        <w:t xml:space="preserve"> </w:t>
+      </w:r>
+      <w:proofErr w:type="spellStart"/>
+      <w:r>
+        <w:t>ehk</w:t>
+      </w:r>
+      <w:proofErr w:type="spellEnd"/>
+      <w:r>
+        <w:t xml:space="preserve"> 30min </w:t>
+      </w:r>
+      <w:proofErr w:type="spellStart"/>
+      <w:r>
+        <w:t>saab</w:t>
+      </w:r>
+      <w:proofErr w:type="spellEnd"/>
+      <w:r>
+        <w:t xml:space="preserve"> </w:t>
+      </w:r>
+      <w:proofErr w:type="spellStart"/>
+      <w:r>
+        <w:t>muuta</w:t>
+      </w:r>
+      <w:proofErr w:type="spellEnd"/>
+      <w:r>
+        <w:t xml:space="preserve"> 1h-ks </w:t>
+      </w:r>
+      <w:proofErr w:type="spellStart"/>
+      <w:r>
+        <w:t>jne</w:t>
+      </w:r>
+      <w:proofErr w:type="spellEnd"/>
+      <w:r>
+        <w:t>.</w:t>
+      </w:r>
+    </w:p>
+    <w:p>
+      <w:pPr>
+        <w:pStyle w:val="ListParagraph"/>
+        <w:numPr>
+          <w:ilvl w:val="0"/>
+          <w:numId w:val="1"/>
+        </w:numPr>
+      </w:pPr>
+      <w:proofErr w:type="spellStart"/>
+      <w:r>
+        <w:t>Üks</w:t>
+      </w:r>
+      <w:proofErr w:type="spellEnd"/>
+      <w:r>
+        <w:t xml:space="preserve"> </w:t>
+      </w:r>
+      <w:proofErr w:type="spellStart"/>
+      <w:r>
+        <w:t>klient</w:t>
+      </w:r>
+      <w:proofErr w:type="spellEnd"/>
+      <w:r>
+        <w:t xml:space="preserve"> </w:t>
+      </w:r>
+      <w:proofErr w:type="spellStart"/>
+      <w:proofErr w:type="gramStart"/>
+      <w:r>
+        <w:t>saab</w:t>
+      </w:r>
+      <w:proofErr w:type="spellEnd"/>
+      <w:proofErr w:type="gramEnd"/>
+      <w:r>
+        <w:t xml:space="preserve"> </w:t>
+      </w:r>
+      <w:proofErr w:type="spellStart"/>
+      <w:r>
+        <w:t>ühe</w:t>
+      </w:r>
+      <w:proofErr w:type="spellEnd"/>
+      <w:r>
+        <w:t xml:space="preserve"> </w:t>
+      </w:r>
+      <w:proofErr w:type="spellStart"/>
+      <w:r>
+        <w:t>arsti</w:t>
+      </w:r>
+      <w:proofErr w:type="spellEnd"/>
+      <w:r>
+        <w:t xml:space="preserve"> </w:t>
+      </w:r>
+      <w:proofErr w:type="spellStart"/>
+      <w:r>
+        <w:t>juurde</w:t>
+      </w:r>
+      <w:proofErr w:type="spellEnd"/>
+      <w:r>
+        <w:t xml:space="preserve"> panna </w:t>
+      </w:r>
+      <w:proofErr w:type="spellStart"/>
+      <w:r>
+        <w:t>ühele</w:t>
+      </w:r>
+      <w:proofErr w:type="spellEnd"/>
+      <w:r>
+        <w:t xml:space="preserve"> </w:t>
+      </w:r>
+      <w:proofErr w:type="spellStart"/>
+      <w:r>
+        <w:t>päevale</w:t>
+      </w:r>
+      <w:proofErr w:type="spellEnd"/>
+      <w:r>
+        <w:t xml:space="preserve"> </w:t>
+      </w:r>
+      <w:proofErr w:type="spellStart"/>
+      <w:r>
+        <w:t>korraga</w:t>
+      </w:r>
+      <w:proofErr w:type="spellEnd"/>
+      <w:r>
+        <w:t xml:space="preserve"> </w:t>
+      </w:r>
+      <w:proofErr w:type="spellStart"/>
+      <w:r>
+        <w:t>ühe</w:t>
+      </w:r>
+      <w:proofErr w:type="spellEnd"/>
+      <w:r>
+        <w:t xml:space="preserve"> </w:t>
+      </w:r>
+      <w:proofErr w:type="spellStart"/>
+      <w:r>
+        <w:t>aja</w:t>
+      </w:r>
+      <w:proofErr w:type="spellEnd"/>
+      <w:r>
+        <w:t>.</w:t>
+      </w:r>
+    </w:p>
+    <w:p>
+      <w:pPr>
+        <w:pStyle w:val="ListParagraph"/>
+      </w:pPr>
+    </w:p>
+    <w:p>
+      <w:pPr>
+        <w:pStyle w:val="Heading1"/>
+      </w:pPr>
+      <w:r>
+        <w:t>Probably must have</w:t>
+      </w:r>
+    </w:p>
+    <w:p/>
+    <w:p>
+      <w:pPr>
+        <w:pStyle w:val="ListParagraph"/>
+        <w:numPr>
+          <w:ilvl w:val="0"/>
+          <w:numId w:val="2"/>
+        </w:numPr>
+      </w:pPr>
+      <w:proofErr w:type="spellStart"/>
+      <w:r>
+        <w:t>Broneeringul</w:t>
+      </w:r>
+      <w:proofErr w:type="spellEnd"/>
+      <w:r>
+        <w:t xml:space="preserve"> </w:t>
+      </w:r>
+      <w:proofErr w:type="spellStart"/>
+      <w:r>
+        <w:t>ajapiirang</w:t>
+      </w:r>
+      <w:proofErr w:type="spellEnd"/>
+      <w:r>
+        <w:t xml:space="preserve">, </w:t>
+      </w:r>
+      <w:proofErr w:type="spellStart"/>
+      <w:r>
+        <w:t>kui</w:t>
+      </w:r>
+      <w:proofErr w:type="spellEnd"/>
+      <w:r>
+        <w:t xml:space="preserve"> </w:t>
+      </w:r>
+      <w:proofErr w:type="spellStart"/>
+      <w:r>
+        <w:t>mitu</w:t>
+      </w:r>
+      <w:proofErr w:type="spellEnd"/>
+      <w:r>
+        <w:t xml:space="preserve"> </w:t>
+      </w:r>
+      <w:proofErr w:type="spellStart"/>
+      <w:r>
+        <w:t>tundi</w:t>
+      </w:r>
+      <w:proofErr w:type="spellEnd"/>
+      <w:r>
+        <w:t xml:space="preserve"> </w:t>
+      </w:r>
+      <w:proofErr w:type="spellStart"/>
+      <w:r>
+        <w:t>enne</w:t>
+      </w:r>
+      <w:proofErr w:type="spellEnd"/>
+      <w:r>
+        <w:t xml:space="preserve"> on </w:t>
+      </w:r>
+      <w:proofErr w:type="spellStart"/>
+      <w:r>
+        <w:t>võimalik</w:t>
+      </w:r>
+      <w:proofErr w:type="spellEnd"/>
+      <w:r>
+        <w:t xml:space="preserve"> </w:t>
+      </w:r>
+      <w:proofErr w:type="spellStart"/>
+      <w:r>
+        <w:t>seda</w:t>
+      </w:r>
+      <w:proofErr w:type="spellEnd"/>
+      <w:r>
+        <w:t xml:space="preserve"> </w:t>
+      </w:r>
+      <w:proofErr w:type="spellStart"/>
+      <w:r>
+        <w:t>veel</w:t>
+      </w:r>
+      <w:proofErr w:type="spellEnd"/>
+      <w:r>
+        <w:t xml:space="preserve"> </w:t>
+      </w:r>
+      <w:proofErr w:type="spellStart"/>
+      <w:r>
+        <w:t>tühistada</w:t>
+      </w:r>
+      <w:proofErr w:type="spellEnd"/>
+      <w:r>
+        <w:t>.</w:t>
+      </w:r>
+    </w:p>
+    <w:p>
+      <w:pPr>
+        <w:pStyle w:val="ListParagraph"/>
+        <w:numPr>
+          <w:ilvl w:val="0"/>
+          <w:numId w:val="2"/>
+        </w:numPr>
+      </w:pPr>
+      <w:proofErr w:type="spellStart"/>
+      <w:r>
+        <w:t>Arvet</w:t>
+      </w:r>
+      <w:proofErr w:type="spellEnd"/>
+      <w:r>
+        <w:t xml:space="preserve"> </w:t>
+      </w:r>
+      <w:proofErr w:type="spellStart"/>
+      <w:proofErr w:type="gramStart"/>
+      <w:r>
+        <w:t>saab</w:t>
+      </w:r>
+      <w:proofErr w:type="spellEnd"/>
+      <w:proofErr w:type="gramEnd"/>
+      <w:r>
+        <w:t xml:space="preserve"> </w:t>
+      </w:r>
+      <w:proofErr w:type="spellStart"/>
+      <w:r>
+        <w:t>luua</w:t>
+      </w:r>
+      <w:proofErr w:type="spellEnd"/>
+      <w:r>
+        <w:t xml:space="preserve"> </w:t>
+      </w:r>
+      <w:proofErr w:type="spellStart"/>
+      <w:r>
+        <w:t>ainult</w:t>
+      </w:r>
+      <w:proofErr w:type="spellEnd"/>
+      <w:r>
+        <w:t xml:space="preserve"> Completed </w:t>
+      </w:r>
+      <w:proofErr w:type="spellStart"/>
+      <w:r>
+        <w:t>broneeringule</w:t>
+      </w:r>
+      <w:proofErr w:type="spellEnd"/>
+      <w:r>
+        <w:t xml:space="preserve">, </w:t>
+      </w:r>
+      <w:proofErr w:type="spellStart"/>
+      <w:r>
+        <w:t>lisana</w:t>
+      </w:r>
+      <w:proofErr w:type="spellEnd"/>
+      <w:r>
+        <w:t xml:space="preserve"> </w:t>
+      </w:r>
+      <w:proofErr w:type="spellStart"/>
+      <w:r>
+        <w:t>v’ib</w:t>
+      </w:r>
+      <w:proofErr w:type="spellEnd"/>
+      <w:r>
+        <w:t xml:space="preserve"> olla </w:t>
+      </w:r>
+      <w:proofErr w:type="spellStart"/>
+      <w:r>
+        <w:t>automaatne</w:t>
+      </w:r>
+      <w:proofErr w:type="spellEnd"/>
+      <w:r>
+        <w:t xml:space="preserve"> </w:t>
+      </w:r>
+      <w:proofErr w:type="spellStart"/>
+      <w:r>
+        <w:t>trahviarve</w:t>
+      </w:r>
+      <w:proofErr w:type="spellEnd"/>
+      <w:r>
+        <w:t xml:space="preserve"> </w:t>
+      </w:r>
+      <w:proofErr w:type="spellStart"/>
+      <w:r>
+        <w:t>NoShow</w:t>
+      </w:r>
+      <w:proofErr w:type="spellEnd"/>
+      <w:r>
+        <w:t xml:space="preserve"> </w:t>
+      </w:r>
+      <w:proofErr w:type="spellStart"/>
+      <w:r>
+        <w:t>kliendile</w:t>
+      </w:r>
+      <w:proofErr w:type="spellEnd"/>
+      <w:r>
+        <w:t>.</w:t>
+      </w:r>
+    </w:p>
+    <w:p>
+      <w:pPr>
+        <w:pStyle w:val="ListParagraph"/>
+        <w:numPr>
+          <w:ilvl w:val="0"/>
+          <w:numId w:val="2"/>
+        </w:numPr>
+      </w:pPr>
+      <w:proofErr w:type="spellStart"/>
+      <w:r>
+        <w:t>Dokumendi</w:t>
+      </w:r>
+      <w:proofErr w:type="spellEnd"/>
+      <w:r>
+        <w:t xml:space="preserve"> </w:t>
+      </w:r>
+      <w:proofErr w:type="spellStart"/>
+      <w:r>
+        <w:t>faili</w:t>
+      </w:r>
+      <w:proofErr w:type="spellEnd"/>
+      <w:r>
+        <w:t xml:space="preserve"> </w:t>
+      </w:r>
+      <w:proofErr w:type="spellStart"/>
+      <w:r>
+        <w:t>suurusele</w:t>
+      </w:r>
+      <w:proofErr w:type="spellEnd"/>
+      <w:r>
+        <w:t xml:space="preserve"> </w:t>
+      </w:r>
+      <w:proofErr w:type="spellStart"/>
+      <w:r>
+        <w:t>määrata</w:t>
+      </w:r>
+      <w:proofErr w:type="spellEnd"/>
+      <w:r>
+        <w:t xml:space="preserve"> max </w:t>
+      </w:r>
+      <w:proofErr w:type="spellStart"/>
+      <w:r>
+        <w:t>suurus</w:t>
+      </w:r>
+      <w:proofErr w:type="spellEnd"/>
+      <w:r>
+        <w:t xml:space="preserve">, </w:t>
+      </w:r>
+      <w:proofErr w:type="spellStart"/>
+      <w:proofErr w:type="gramStart"/>
+      <w:r>
+        <w:t>nt</w:t>
+      </w:r>
+      <w:proofErr w:type="spellEnd"/>
+      <w:proofErr w:type="gramEnd"/>
+      <w:r>
+        <w:t xml:space="preserve"> 10MB fail</w:t>
+      </w:r>
+      <w:r>
+        <w:t>.</w:t>
+      </w:r>
+    </w:p>
+    <w:p>
+      <w:pPr>
+        <w:pStyle w:val="ListParagraph"/>
+      </w:pPr>
+    </w:p>
+    <w:p>
+      <w:pPr>
+        <w:pStyle w:val="Heading1"/>
+      </w:pPr>
+      <w:r>
+        <w:t>Nice to have</w:t>
+      </w:r>
+    </w:p>
+    <w:p>
+      <w:pPr>
+        <w:rPr>
+          <w:rFonts w:ascii="Calibri" w:hAnsi="Calibri" w:cs="Calibri"/>
+          <w:noProof/>
+          <w:sz w:val="24"/>
+          <w:szCs w:val="24"/>
+        </w:rPr>
+      </w:pPr>
+    </w:p>
+    <w:p>
+      <w:pPr>
+        <w:pStyle w:val="ListParagraph"/>
+        <w:numPr>
+          <w:ilvl w:val="0"/>
+          <w:numId w:val="3"/>
+        </w:numPr>
+        <w:rPr>
+          <w:rFonts w:ascii="Calibri" w:hAnsi="Calibri" w:cs="Calibri"/>
+          <w:noProof/>
+          <w:sz w:val="24"/>
+          <w:szCs w:val="24"/>
+        </w:rPr>
+      </w:pPr>
+      <w:r>
+        <w:rPr>
+          <w:rFonts w:ascii="Calibri" w:hAnsi="Calibri" w:cs="Calibri"/>
+          <w:noProof/>
+          <w:sz w:val="24"/>
+          <w:szCs w:val="24"/>
+        </w:rPr>
+        <w:t>E-postile automaatsed teavitused peale broneeringu kinnitust ning kindel arv tunde enne broneeringu toimumist</w:t>
+      </w:r>
+      <w:r>
+        <w:rPr>
+          <w:rFonts w:ascii="Calibri" w:hAnsi="Calibri" w:cs="Calibri"/>
+          <w:noProof/>
+          <w:sz w:val="24"/>
+          <w:szCs w:val="24"/>
+        </w:rPr>
+        <w:t>.</w:t>
+      </w:r>
+    </w:p>
+    <w:p>
+      <w:pPr>
+        <w:pStyle w:val="ListParagraph"/>
+        <w:numPr>
+          <w:ilvl w:val="0"/>
+          <w:numId w:val="3"/>
+        </w:numPr>
+        <w:rPr>
+          <w:rFonts w:ascii="Calibri" w:hAnsi="Calibri" w:cs="Calibri"/>
+          <w:noProof/>
+          <w:sz w:val="24"/>
+          <w:szCs w:val="24"/>
+        </w:rPr>
+      </w:pPr>
+      <w:r>
+        <w:rPr>
+          <w:rFonts w:ascii="Calibri" w:hAnsi="Calibri" w:cs="Calibri"/>
+          <w:noProof/>
+          <w:sz w:val="24"/>
+          <w:szCs w:val="24"/>
+        </w:rPr>
+        <w:t>Automaatne InvpicceNum genereerimine.</w:t>
+      </w:r>
+    </w:p>
+    <w:p>
+      <w:pPr>
+        <w:rPr>
+          <w:rFonts w:ascii="Calibri" w:hAnsi="Calibri" w:cs="Calibri"/>
+          <w:noProof/>
+          <w:sz w:val="24"/>
+          <w:szCs w:val="24"/>
+        </w:rPr>
+      </w:pPr>
+    </w:p>
+    <w:p>
+      <w:pPr>
+        <w:pStyle w:val="Heading1"/>
+        <w:rPr>
+          <w:noProof/>
+        </w:rPr>
+      </w:pPr>
+      <w:r>
+        <w:rPr>
+          <w:noProof/>
+        </w:rPr>
+        <w:t>Turvalisuse reeglid</w:t>
+      </w:r>
+    </w:p>
+    <w:p/>
+    <w:p>
+      <w:pPr>
+        <w:pStyle w:val="ListParagraph"/>
+        <w:numPr>
+          <w:ilvl w:val="0"/>
+          <w:numId w:val="4"/>
+        </w:numPr>
+      </w:pPr>
+      <w:proofErr w:type="spellStart"/>
+      <w:r>
+        <w:t>Klient</w:t>
+      </w:r>
+      <w:proofErr w:type="spellEnd"/>
+      <w:r>
+        <w:t xml:space="preserve"> </w:t>
+      </w:r>
+      <w:proofErr w:type="spellStart"/>
+      <w:r>
+        <w:t>näeb</w:t>
+      </w:r>
+      <w:proofErr w:type="spellEnd"/>
+      <w:r>
+        <w:t xml:space="preserve"> </w:t>
+      </w:r>
+      <w:proofErr w:type="spellStart"/>
+      <w:r>
+        <w:t>ainult</w:t>
+      </w:r>
+      <w:proofErr w:type="spellEnd"/>
+      <w:r>
+        <w:t xml:space="preserve"> </w:t>
+      </w:r>
+      <w:proofErr w:type="spellStart"/>
+      <w:r>
+        <w:t>oma</w:t>
+      </w:r>
+      <w:proofErr w:type="spellEnd"/>
+      <w:r>
+        <w:t xml:space="preserve"> </w:t>
+      </w:r>
+      <w:proofErr w:type="spellStart"/>
+      <w:r>
+        <w:t>andmeid</w:t>
+      </w:r>
+      <w:proofErr w:type="spellEnd"/>
+      <w:r>
+        <w:t xml:space="preserve">. </w:t>
+      </w:r>
+    </w:p>
+    <w:p>
+      <w:pPr>
+        <w:pStyle w:val="ListParagraph"/>
+        <w:numPr>
+          <w:ilvl w:val="0"/>
+          <w:numId w:val="4"/>
+        </w:numPr>
+      </w:pPr>
+      <w:proofErr w:type="spellStart"/>
+      <w:r>
+        <w:t>Broneeringu</w:t>
+      </w:r>
+      <w:proofErr w:type="spellEnd"/>
+      <w:r>
+        <w:t xml:space="preserve"> </w:t>
+      </w:r>
+      <w:proofErr w:type="spellStart"/>
+      <w:r>
+        <w:t>süsteemis</w:t>
+      </w:r>
+      <w:proofErr w:type="spellEnd"/>
+      <w:r>
+        <w:t xml:space="preserve"> on </w:t>
+      </w:r>
+      <w:proofErr w:type="spellStart"/>
+      <w:r>
+        <w:t>mitte-saadava</w:t>
+      </w:r>
+      <w:proofErr w:type="spellEnd"/>
+      <w:r>
+        <w:t xml:space="preserve"> </w:t>
+      </w:r>
+      <w:proofErr w:type="spellStart"/>
+      <w:r>
+        <w:t>ajad</w:t>
+      </w:r>
+      <w:proofErr w:type="spellEnd"/>
+      <w:r>
+        <w:t xml:space="preserve"> </w:t>
+      </w:r>
+      <w:proofErr w:type="spellStart"/>
+      <w:r>
+        <w:t>valiku</w:t>
+      </w:r>
+      <w:proofErr w:type="spellEnd"/>
+      <w:r>
+        <w:t xml:space="preserve"> </w:t>
+      </w:r>
+      <w:proofErr w:type="spellStart"/>
+      <w:r>
+        <w:t>osas</w:t>
+      </w:r>
+      <w:proofErr w:type="spellEnd"/>
+      <w:r>
+        <w:t xml:space="preserve"> </w:t>
+      </w:r>
+      <w:proofErr w:type="spellStart"/>
+      <w:r>
+        <w:t>lihtsalt</w:t>
+      </w:r>
+      <w:proofErr w:type="spellEnd"/>
+      <w:r>
+        <w:t xml:space="preserve"> </w:t>
+      </w:r>
+      <w:proofErr w:type="spellStart"/>
+      <w:r>
+        <w:t>inaktiivsed</w:t>
+      </w:r>
+      <w:proofErr w:type="spellEnd"/>
+      <w:r>
+        <w:t>.</w:t>
+      </w:r>
+    </w:p>
+    <w:p>
+      <w:pPr>
+        <w:pStyle w:val="ListParagraph"/>
+        <w:numPr>
+          <w:ilvl w:val="0"/>
+          <w:numId w:val="4"/>
+        </w:numPr>
+      </w:pPr>
+      <w:proofErr w:type="spellStart"/>
+      <w:r>
+        <w:t>Arst</w:t>
+      </w:r>
+      <w:proofErr w:type="spellEnd"/>
+      <w:r>
+        <w:t xml:space="preserve"> </w:t>
+      </w:r>
+      <w:proofErr w:type="spellStart"/>
+      <w:r>
+        <w:t>näeb</w:t>
+      </w:r>
+      <w:proofErr w:type="spellEnd"/>
+      <w:r>
+        <w:t xml:space="preserve"> </w:t>
+      </w:r>
+      <w:proofErr w:type="spellStart"/>
+      <w:r>
+        <w:t>ainult</w:t>
+      </w:r>
+      <w:proofErr w:type="spellEnd"/>
+      <w:r>
+        <w:t xml:space="preserve"> </w:t>
+      </w:r>
+      <w:proofErr w:type="spellStart"/>
+      <w:r>
+        <w:t>oma</w:t>
+      </w:r>
+      <w:proofErr w:type="spellEnd"/>
+      <w:r>
+        <w:t xml:space="preserve"> </w:t>
+      </w:r>
+      <w:proofErr w:type="spellStart"/>
+      <w:r>
+        <w:t>patsiente</w:t>
+      </w:r>
+      <w:proofErr w:type="spellEnd"/>
+      <w:r>
+        <w:t>.</w:t>
+      </w:r>
+    </w:p>
+    <w:p>
+      <w:pPr>
+        <w:pStyle w:val="ListParagraph"/>
+        <w:numPr>
+          <w:ilvl w:val="0"/>
+          <w:numId w:val="4"/>
+        </w:numPr>
+      </w:pPr>
+      <w:r>
+        <w:t xml:space="preserve">Admin </w:t>
+      </w:r>
+      <w:proofErr w:type="spellStart"/>
+      <w:r>
+        <w:t>näeb</w:t>
+      </w:r>
+      <w:proofErr w:type="spellEnd"/>
+      <w:r>
+        <w:t xml:space="preserve"> </w:t>
+      </w:r>
+      <w:proofErr w:type="spellStart"/>
+      <w:r>
+        <w:t>kõike</w:t>
+      </w:r>
+      <w:proofErr w:type="spellEnd"/>
+      <w:r>
+        <w:t>.</w:t>
+      </w:r>
+    </w:p>
+    <w:p>
+      <w:pPr>
+        <w:pStyle w:val="ListParagraph"/>
+        <w:numPr>
+          <w:ilvl w:val="0"/>
+          <w:numId w:val="4"/>
+        </w:numPr>
+      </w:pPr>
+      <w:proofErr w:type="spellStart"/>
+      <w:r>
+        <w:t>Paroolid</w:t>
+      </w:r>
+      <w:proofErr w:type="spellEnd"/>
+      <w:r>
+        <w:t xml:space="preserve"> </w:t>
+      </w:r>
+      <w:proofErr w:type="spellStart"/>
+      <w:r>
+        <w:t>ainult</w:t>
+      </w:r>
+      <w:proofErr w:type="spellEnd"/>
+      <w:r>
+        <w:t xml:space="preserve"> hash-</w:t>
+      </w:r>
+      <w:proofErr w:type="spellStart"/>
+      <w:r>
+        <w:t>itult</w:t>
+      </w:r>
+      <w:proofErr w:type="spellEnd"/>
+    </w:p>
+    <w:p>
+      <w:pPr>
+        <w:rPr>
+          <w:rFonts w:ascii="Calibri" w:hAnsi="Calibri" w:cs="Calibri"/>
+          <w:noProof/>
+          <w:sz w:val="24"/>
+          <w:szCs w:val="24"/>
+        </w:rPr>
+      </w:pPr>
+      <w:bookmarkStart w:id="0" w:name="_GoBack"/>
+      <w:bookmarkEnd w:id="0"/>
+    </w:p>
     <w:sectPr>
       <w:pgSz w:w="12240" w:h="15840"/>
       <w:pgMar w:top="1440" w:right="1440" w:bottom="1440" w:left="1440" w:header="708" w:footer="708" w:gutter="0"/>
@@ -7349,6 +9002,367 @@
     </w:sectPr>
   </w:body>
 </w:document>
+</file>
+
+<file path=word/numbering.xml><?xml version="1.0" encoding="utf-8"?>
+<w:numbering xmlns:wpc="http://schemas.microsoft.com/office/word/2010/wordprocessingCanvas" xmlns:mc="http://schemas.openxmlformats.org/markup-compatibility/2006" xmlns:o="urn:schemas-microsoft-com:office:office" xmlns:r="http://schemas.openxmlformats.org/officeDocument/2006/relationships" xmlns:m="http://schemas.openxmlformats.org/officeDocument/2006/math" xmlns:v="urn:schemas-microsoft-com:vml" xmlns:wp14="http://schemas.microsoft.com/office/word/2010/wordprocessingDrawing" xmlns:wp="http://schemas.openxmlformats.org/drawingml/2006/wordprocessingDrawing" xmlns:w10="urn:schemas-microsoft-com:office:word" xmlns:w="http://schemas.openxmlformats.org/wordprocessingml/2006/main" xmlns:w14="http://schemas.microsoft.com/office/word/2010/wordml" xmlns:w15="http://schemas.microsoft.com/office/word/2012/wordml" xmlns:wpg="http://schemas.microsoft.com/office/word/2010/wordprocessingGroup" xmlns:wpi="http://schemas.microsoft.com/office/word/2010/wordprocessingInk" xmlns:wne="http://schemas.microsoft.com/office/word/2006/wordml" xmlns:wps="http://schemas.microsoft.com/office/word/2010/wordprocessingShape" mc:Ignorable="w14 w15 wp14">
+  <w:abstractNum w:abstractNumId="0" w15:restartNumberingAfterBreak="0">
+    <w:nsid w:val="05500DCA"/>
+    <w:multiLevelType w:val="hybridMultilevel"/>
+    <w:tmpl w:val="3C563458"/>
+    <w:lvl w:ilvl="0" w:tplc="0409000F">
+      <w:start w:val="1"/>
+      <w:numFmt w:val="decimal"/>
+      <w:lvlText w:val="%1."/>
+      <w:lvlJc w:val="left"/>
+      <w:pPr>
+        <w:ind w:left="720" w:hanging="360"/>
+      </w:pPr>
+    </w:lvl>
+    <w:lvl w:ilvl="1" w:tplc="04090019" w:tentative="1">
+      <w:start w:val="1"/>
+      <w:numFmt w:val="lowerLetter"/>
+      <w:lvlText w:val="%2."/>
+      <w:lvlJc w:val="left"/>
+      <w:pPr>
+        <w:ind w:left="1440" w:hanging="360"/>
+      </w:pPr>
+    </w:lvl>
+    <w:lvl w:ilvl="2" w:tplc="0409001B" w:tentative="1">
+      <w:start w:val="1"/>
+      <w:numFmt w:val="lowerRoman"/>
+      <w:lvlText w:val="%3."/>
+      <w:lvlJc w:val="right"/>
+      <w:pPr>
+        <w:ind w:left="2160" w:hanging="180"/>
+      </w:pPr>
+    </w:lvl>
+    <w:lvl w:ilvl="3" w:tplc="0409000F" w:tentative="1">
+      <w:start w:val="1"/>
+      <w:numFmt w:val="decimal"/>
+      <w:lvlText w:val="%4."/>
+      <w:lvlJc w:val="left"/>
+      <w:pPr>
+        <w:ind w:left="2880" w:hanging="360"/>
+      </w:pPr>
+    </w:lvl>
+    <w:lvl w:ilvl="4" w:tplc="04090019" w:tentative="1">
+      <w:start w:val="1"/>
+      <w:numFmt w:val="lowerLetter"/>
+      <w:lvlText w:val="%5."/>
+      <w:lvlJc w:val="left"/>
+      <w:pPr>
+        <w:ind w:left="3600" w:hanging="360"/>
+      </w:pPr>
+    </w:lvl>
+    <w:lvl w:ilvl="5" w:tplc="0409001B" w:tentative="1">
+      <w:start w:val="1"/>
+      <w:numFmt w:val="lowerRoman"/>
+      <w:lvlText w:val="%6."/>
+      <w:lvlJc w:val="right"/>
+      <w:pPr>
+        <w:ind w:left="4320" w:hanging="180"/>
+      </w:pPr>
+    </w:lvl>
+    <w:lvl w:ilvl="6" w:tplc="0409000F" w:tentative="1">
+      <w:start w:val="1"/>
+      <w:numFmt w:val="decimal"/>
+      <w:lvlText w:val="%7."/>
+      <w:lvlJc w:val="left"/>
+      <w:pPr>
+        <w:ind w:left="5040" w:hanging="360"/>
+      </w:pPr>
+    </w:lvl>
+    <w:lvl w:ilvl="7" w:tplc="04090019" w:tentative="1">
+      <w:start w:val="1"/>
+      <w:numFmt w:val="lowerLetter"/>
+      <w:lvlText w:val="%8."/>
+      <w:lvlJc w:val="left"/>
+      <w:pPr>
+        <w:ind w:left="5760" w:hanging="360"/>
+      </w:pPr>
+    </w:lvl>
+    <w:lvl w:ilvl="8" w:tplc="0409001B" w:tentative="1">
+      <w:start w:val="1"/>
+      <w:numFmt w:val="lowerRoman"/>
+      <w:lvlText w:val="%9."/>
+      <w:lvlJc w:val="right"/>
+      <w:pPr>
+        <w:ind w:left="6480" w:hanging="180"/>
+      </w:pPr>
+    </w:lvl>
+  </w:abstractNum>
+  <w:abstractNum w:abstractNumId="1" w15:restartNumberingAfterBreak="0">
+    <w:nsid w:val="196C0A8E"/>
+    <w:multiLevelType w:val="hybridMultilevel"/>
+    <w:tmpl w:val="3F10D942"/>
+    <w:lvl w:ilvl="0" w:tplc="0409000F">
+      <w:start w:val="1"/>
+      <w:numFmt w:val="decimal"/>
+      <w:lvlText w:val="%1."/>
+      <w:lvlJc w:val="left"/>
+      <w:pPr>
+        <w:ind w:left="720" w:hanging="360"/>
+      </w:pPr>
+    </w:lvl>
+    <w:lvl w:ilvl="1" w:tplc="04090019" w:tentative="1">
+      <w:start w:val="1"/>
+      <w:numFmt w:val="lowerLetter"/>
+      <w:lvlText w:val="%2."/>
+      <w:lvlJc w:val="left"/>
+      <w:pPr>
+        <w:ind w:left="1440" w:hanging="360"/>
+      </w:pPr>
+    </w:lvl>
+    <w:lvl w:ilvl="2" w:tplc="0409001B" w:tentative="1">
+      <w:start w:val="1"/>
+      <w:numFmt w:val="lowerRoman"/>
+      <w:lvlText w:val="%3."/>
+      <w:lvlJc w:val="right"/>
+      <w:pPr>
+        <w:ind w:left="2160" w:hanging="180"/>
+      </w:pPr>
+    </w:lvl>
+    <w:lvl w:ilvl="3" w:tplc="0409000F" w:tentative="1">
+      <w:start w:val="1"/>
+      <w:numFmt w:val="decimal"/>
+      <w:lvlText w:val="%4."/>
+      <w:lvlJc w:val="left"/>
+      <w:pPr>
+        <w:ind w:left="2880" w:hanging="360"/>
+      </w:pPr>
+    </w:lvl>
+    <w:lvl w:ilvl="4" w:tplc="04090019" w:tentative="1">
+      <w:start w:val="1"/>
+      <w:numFmt w:val="lowerLetter"/>
+      <w:lvlText w:val="%5."/>
+      <w:lvlJc w:val="left"/>
+      <w:pPr>
+        <w:ind w:left="3600" w:hanging="360"/>
+      </w:pPr>
+    </w:lvl>
+    <w:lvl w:ilvl="5" w:tplc="0409001B" w:tentative="1">
+      <w:start w:val="1"/>
+      <w:numFmt w:val="lowerRoman"/>
+      <w:lvlText w:val="%6."/>
+      <w:lvlJc w:val="right"/>
+      <w:pPr>
+        <w:ind w:left="4320" w:hanging="180"/>
+      </w:pPr>
+    </w:lvl>
+    <w:lvl w:ilvl="6" w:tplc="0409000F" w:tentative="1">
+      <w:start w:val="1"/>
+      <w:numFmt w:val="decimal"/>
+      <w:lvlText w:val="%7."/>
+      <w:lvlJc w:val="left"/>
+      <w:pPr>
+        <w:ind w:left="5040" w:hanging="360"/>
+      </w:pPr>
+    </w:lvl>
+    <w:lvl w:ilvl="7" w:tplc="04090019" w:tentative="1">
+      <w:start w:val="1"/>
+      <w:numFmt w:val="lowerLetter"/>
+      <w:lvlText w:val="%8."/>
+      <w:lvlJc w:val="left"/>
+      <w:pPr>
+        <w:ind w:left="5760" w:hanging="360"/>
+      </w:pPr>
+    </w:lvl>
+    <w:lvl w:ilvl="8" w:tplc="0409001B" w:tentative="1">
+      <w:start w:val="1"/>
+      <w:numFmt w:val="lowerRoman"/>
+      <w:lvlText w:val="%9."/>
+      <w:lvlJc w:val="right"/>
+      <w:pPr>
+        <w:ind w:left="6480" w:hanging="180"/>
+      </w:pPr>
+    </w:lvl>
+  </w:abstractNum>
+  <w:abstractNum w:abstractNumId="2" w15:restartNumberingAfterBreak="0">
+    <w:nsid w:val="528B5987"/>
+    <w:multiLevelType w:val="hybridMultilevel"/>
+    <w:tmpl w:val="96441A54"/>
+    <w:lvl w:ilvl="0" w:tplc="0409000F">
+      <w:start w:val="1"/>
+      <w:numFmt w:val="decimal"/>
+      <w:lvlText w:val="%1."/>
+      <w:lvlJc w:val="left"/>
+      <w:pPr>
+        <w:ind w:left="720" w:hanging="360"/>
+      </w:pPr>
+    </w:lvl>
+    <w:lvl w:ilvl="1" w:tplc="04090019" w:tentative="1">
+      <w:start w:val="1"/>
+      <w:numFmt w:val="lowerLetter"/>
+      <w:lvlText w:val="%2."/>
+      <w:lvlJc w:val="left"/>
+      <w:pPr>
+        <w:ind w:left="1440" w:hanging="360"/>
+      </w:pPr>
+    </w:lvl>
+    <w:lvl w:ilvl="2" w:tplc="0409001B" w:tentative="1">
+      <w:start w:val="1"/>
+      <w:numFmt w:val="lowerRoman"/>
+      <w:lvlText w:val="%3."/>
+      <w:lvlJc w:val="right"/>
+      <w:pPr>
+        <w:ind w:left="2160" w:hanging="180"/>
+      </w:pPr>
+    </w:lvl>
+    <w:lvl w:ilvl="3" w:tplc="0409000F" w:tentative="1">
+      <w:start w:val="1"/>
+      <w:numFmt w:val="decimal"/>
+      <w:lvlText w:val="%4."/>
+      <w:lvlJc w:val="left"/>
+      <w:pPr>
+        <w:ind w:left="2880" w:hanging="360"/>
+      </w:pPr>
+    </w:lvl>
+    <w:lvl w:ilvl="4" w:tplc="04090019" w:tentative="1">
+      <w:start w:val="1"/>
+      <w:numFmt w:val="lowerLetter"/>
+      <w:lvlText w:val="%5."/>
+      <w:lvlJc w:val="left"/>
+      <w:pPr>
+        <w:ind w:left="3600" w:hanging="360"/>
+      </w:pPr>
+    </w:lvl>
+    <w:lvl w:ilvl="5" w:tplc="0409001B" w:tentative="1">
+      <w:start w:val="1"/>
+      <w:numFmt w:val="lowerRoman"/>
+      <w:lvlText w:val="%6."/>
+      <w:lvlJc w:val="right"/>
+      <w:pPr>
+        <w:ind w:left="4320" w:hanging="180"/>
+      </w:pPr>
+    </w:lvl>
+    <w:lvl w:ilvl="6" w:tplc="0409000F" w:tentative="1">
+      <w:start w:val="1"/>
+      <w:numFmt w:val="decimal"/>
+      <w:lvlText w:val="%7."/>
+      <w:lvlJc w:val="left"/>
+      <w:pPr>
+        <w:ind w:left="5040" w:hanging="360"/>
+      </w:pPr>
+    </w:lvl>
+    <w:lvl w:ilvl="7" w:tplc="04090019" w:tentative="1">
+      <w:start w:val="1"/>
+      <w:numFmt w:val="lowerLetter"/>
+      <w:lvlText w:val="%8."/>
+      <w:lvlJc w:val="left"/>
+      <w:pPr>
+        <w:ind w:left="5760" w:hanging="360"/>
+      </w:pPr>
+    </w:lvl>
+    <w:lvl w:ilvl="8" w:tplc="0409001B" w:tentative="1">
+      <w:start w:val="1"/>
+      <w:numFmt w:val="lowerRoman"/>
+      <w:lvlText w:val="%9."/>
+      <w:lvlJc w:val="right"/>
+      <w:pPr>
+        <w:ind w:left="6480" w:hanging="180"/>
+      </w:pPr>
+    </w:lvl>
+  </w:abstractNum>
+  <w:abstractNum w:abstractNumId="3" w15:restartNumberingAfterBreak="0">
+    <w:nsid w:val="76AA2D2A"/>
+    <w:multiLevelType w:val="hybridMultilevel"/>
+    <w:tmpl w:val="9C920026"/>
+    <w:lvl w:ilvl="0" w:tplc="0409000F">
+      <w:start w:val="1"/>
+      <w:numFmt w:val="decimal"/>
+      <w:lvlText w:val="%1."/>
+      <w:lvlJc w:val="left"/>
+      <w:pPr>
+        <w:ind w:left="720" w:hanging="360"/>
+      </w:pPr>
+    </w:lvl>
+    <w:lvl w:ilvl="1" w:tplc="04090019" w:tentative="1">
+      <w:start w:val="1"/>
+      <w:numFmt w:val="lowerLetter"/>
+      <w:lvlText w:val="%2."/>
+      <w:lvlJc w:val="left"/>
+      <w:pPr>
+        <w:ind w:left="1440" w:hanging="360"/>
+      </w:pPr>
+    </w:lvl>
+    <w:lvl w:ilvl="2" w:tplc="0409001B" w:tentative="1">
+      <w:start w:val="1"/>
+      <w:numFmt w:val="lowerRoman"/>
+      <w:lvlText w:val="%3."/>
+      <w:lvlJc w:val="right"/>
+      <w:pPr>
+        <w:ind w:left="2160" w:hanging="180"/>
+      </w:pPr>
+    </w:lvl>
+    <w:lvl w:ilvl="3" w:tplc="0409000F" w:tentative="1">
+      <w:start w:val="1"/>
+      <w:numFmt w:val="decimal"/>
+      <w:lvlText w:val="%4."/>
+      <w:lvlJc w:val="left"/>
+      <w:pPr>
+        <w:ind w:left="2880" w:hanging="360"/>
+      </w:pPr>
+    </w:lvl>
+    <w:lvl w:ilvl="4" w:tplc="04090019" w:tentative="1">
+      <w:start w:val="1"/>
+      <w:numFmt w:val="lowerLetter"/>
+      <w:lvlText w:val="%5."/>
+      <w:lvlJc w:val="left"/>
+      <w:pPr>
+        <w:ind w:left="3600" w:hanging="360"/>
+      </w:pPr>
+    </w:lvl>
+    <w:lvl w:ilvl="5" w:tplc="0409001B" w:tentative="1">
+      <w:start w:val="1"/>
+      <w:numFmt w:val="lowerRoman"/>
+      <w:lvlText w:val="%6."/>
+      <w:lvlJc w:val="right"/>
+      <w:pPr>
+        <w:ind w:left="4320" w:hanging="180"/>
+      </w:pPr>
+    </w:lvl>
+    <w:lvl w:ilvl="6" w:tplc="0409000F" w:tentative="1">
+      <w:start w:val="1"/>
+      <w:numFmt w:val="decimal"/>
+      <w:lvlText w:val="%7."/>
+      <w:lvlJc w:val="left"/>
+      <w:pPr>
+        <w:ind w:left="5040" w:hanging="360"/>
+      </w:pPr>
+    </w:lvl>
+    <w:lvl w:ilvl="7" w:tplc="04090019" w:tentative="1">
+      <w:start w:val="1"/>
+      <w:numFmt w:val="lowerLetter"/>
+      <w:lvlText w:val="%8."/>
+      <w:lvlJc w:val="left"/>
+      <w:pPr>
+        <w:ind w:left="5760" w:hanging="360"/>
+      </w:pPr>
+    </w:lvl>
+    <w:lvl w:ilvl="8" w:tplc="0409001B" w:tentative="1">
+      <w:start w:val="1"/>
+      <w:numFmt w:val="lowerRoman"/>
+      <w:lvlText w:val="%9."/>
+      <w:lvlJc w:val="right"/>
+      <w:pPr>
+        <w:ind w:left="6480" w:hanging="180"/>
+      </w:pPr>
+    </w:lvl>
+  </w:abstractNum>
+  <w:num w:numId="1">
+    <w:abstractNumId w:val="0"/>
+  </w:num>
+  <w:num w:numId="2">
+    <w:abstractNumId w:val="1"/>
+  </w:num>
+  <w:num w:numId="3">
+    <w:abstractNumId w:val="3"/>
+  </w:num>
+  <w:num w:numId="4">
+    <w:abstractNumId w:val="2"/>
+  </w:num>
+</w:numbering>
 </file>
 
 <file path=word/styles.xml><?xml version="1.0" encoding="utf-8"?>
@@ -7747,6 +9761,27 @@
     <w:name w:val="Normal"/>
     <w:qFormat/>
   </w:style>
+  <w:style w:type="paragraph" w:styleId="Heading1">
+    <w:name w:val="heading 1"/>
+    <w:basedOn w:val="Normal"/>
+    <w:next w:val="Normal"/>
+    <w:link w:val="Heading1Char"/>
+    <w:uiPriority w:val="9"/>
+    <w:qFormat/>
+    <w:rsid w:val="00F72064"/>
+    <w:pPr>
+      <w:keepNext/>
+      <w:keepLines/>
+      <w:spacing w:before="240" w:after="0"/>
+      <w:outlineLvl w:val="0"/>
+    </w:pPr>
+    <w:rPr>
+      <w:rFonts w:asciiTheme="majorHAnsi" w:eastAsiaTheme="majorEastAsia" w:hAnsiTheme="majorHAnsi" w:cstheme="majorBidi"/>
+      <w:color w:val="2E74B5" w:themeColor="accent1" w:themeShade="BF"/>
+      <w:sz w:val="32"/>
+      <w:szCs w:val="32"/>
+    </w:rPr>
+  </w:style>
   <w:style w:type="character" w:default="1" w:styleId="DefaultParagraphFont">
     <w:name w:val="Default Paragraph Font"/>
     <w:uiPriority w:val="1"/>
@@ -7792,6 +9827,73 @@
         <w:insideV w:val="single" w:sz="4" w:space="0" w:color="auto"/>
       </w:tblBorders>
     </w:tblPr>
+  </w:style>
+  <w:style w:type="paragraph" w:styleId="Title">
+    <w:name w:val="Title"/>
+    <w:basedOn w:val="Normal"/>
+    <w:next w:val="Normal"/>
+    <w:link w:val="TitleChar"/>
+    <w:uiPriority w:val="10"/>
+    <w:qFormat/>
+    <w:rsid w:val="00F72064"/>
+    <w:pPr>
+      <w:spacing w:after="0" w:line="240" w:lineRule="auto"/>
+      <w:contextualSpacing/>
+    </w:pPr>
+    <w:rPr>
+      <w:rFonts w:asciiTheme="majorHAnsi" w:eastAsiaTheme="majorEastAsia" w:hAnsiTheme="majorHAnsi" w:cstheme="majorBidi"/>
+      <w:spacing w:val="-10"/>
+      <w:kern w:val="28"/>
+      <w:sz w:val="56"/>
+      <w:szCs w:val="56"/>
+    </w:rPr>
+  </w:style>
+  <w:style w:type="character" w:customStyle="1" w:styleId="TitleChar">
+    <w:name w:val="Title Char"/>
+    <w:basedOn w:val="DefaultParagraphFont"/>
+    <w:link w:val="Title"/>
+    <w:uiPriority w:val="10"/>
+    <w:rsid w:val="00F72064"/>
+    <w:rPr>
+      <w:rFonts w:asciiTheme="majorHAnsi" w:eastAsiaTheme="majorEastAsia" w:hAnsiTheme="majorHAnsi" w:cstheme="majorBidi"/>
+      <w:spacing w:val="-10"/>
+      <w:kern w:val="28"/>
+      <w:sz w:val="56"/>
+      <w:szCs w:val="56"/>
+    </w:rPr>
+  </w:style>
+  <w:style w:type="paragraph" w:styleId="NoSpacing">
+    <w:name w:val="No Spacing"/>
+    <w:uiPriority w:val="1"/>
+    <w:qFormat/>
+    <w:rsid w:val="00F72064"/>
+    <w:pPr>
+      <w:spacing w:after="0" w:line="240" w:lineRule="auto"/>
+    </w:pPr>
+  </w:style>
+  <w:style w:type="character" w:customStyle="1" w:styleId="Heading1Char">
+    <w:name w:val="Heading 1 Char"/>
+    <w:basedOn w:val="DefaultParagraphFont"/>
+    <w:link w:val="Heading1"/>
+    <w:uiPriority w:val="9"/>
+    <w:rsid w:val="00F72064"/>
+    <w:rPr>
+      <w:rFonts w:asciiTheme="majorHAnsi" w:eastAsiaTheme="majorEastAsia" w:hAnsiTheme="majorHAnsi" w:cstheme="majorBidi"/>
+      <w:color w:val="2E74B5" w:themeColor="accent1" w:themeShade="BF"/>
+      <w:sz w:val="32"/>
+      <w:szCs w:val="32"/>
+    </w:rPr>
+  </w:style>
+  <w:style w:type="paragraph" w:styleId="ListParagraph">
+    <w:name w:val="List Paragraph"/>
+    <w:basedOn w:val="Normal"/>
+    <w:uiPriority w:val="34"/>
+    <w:qFormat/>
+    <w:rsid w:val="00F72064"/>
+    <w:pPr>
+      <w:ind w:left="720"/>
+      <w:contextualSpacing/>
+    </w:pPr>
   </w:style>
 </w:styles>
 </file>

</xml_diff>

<commit_message>
Add save command files. Correct data annotations.
</commit_message>
<xml_diff>
--- a/docs/Martmaa_Invoice_model.docx
+++ b/docs/Martmaa_Invoice_model.docx
@@ -763,7 +763,7 @@
                 <w:sz w:val="24"/>
                 <w:szCs w:val="24"/>
               </w:rPr>
-              <w:t>50</w:t>
+              <w:t>2 - 50</w:t>
             </w:r>
           </w:p>
         </w:tc>
@@ -877,6 +877,14 @@
                 <w:szCs w:val="24"/>
               </w:rPr>
             </w:pPr>
+            <w:r>
+              <w:rPr>
+                <w:rFonts w:ascii="Calibri" w:hAnsi="Calibri" w:cs="Calibri"/>
+                <w:sz w:val="24"/>
+                <w:szCs w:val="24"/>
+              </w:rPr>
+              <w:t xml:space="preserve">2 - </w:t>
+            </w:r>
             <w:r>
               <w:rPr>
                 <w:rFonts w:ascii="Calibri" w:hAnsi="Calibri" w:cs="Calibri"/>
@@ -1970,6 +1978,8 @@
             </w:r>
           </w:p>
         </w:tc>
+        <w:bookmarkStart w:id="0" w:name="_GoBack"/>
+        <w:bookmarkEnd w:id="0"/>
       </w:tr>
       <w:tr>
         <w:tc>
@@ -8991,8 +9001,6 @@
           <w:szCs w:val="24"/>
         </w:rPr>
       </w:pPr>
-      <w:bookmarkStart w:id="0" w:name="_GoBack"/>
-      <w:bookmarkEnd w:id="0"/>
     </w:p>
     <w:sectPr>
       <w:pgSz w:w="12240" w:h="15840"/>

</xml_diff>

<commit_message>
Add save command validators; other corrections.
</commit_message>
<xml_diff>
--- a/docs/Martmaa_Invoice_model.docx
+++ b/docs/Martmaa_Invoice_model.docx
@@ -237,7 +237,6 @@
                 <w:szCs w:val="24"/>
               </w:rPr>
             </w:pPr>
-            <w:proofErr w:type="spellStart"/>
             <w:r>
               <w:rPr>
                 <w:rFonts w:ascii="Calibri" w:hAnsi="Calibri" w:cs="Calibri"/>
@@ -246,7 +245,6 @@
               </w:rPr>
               <w:t>UserId</w:t>
             </w:r>
-            <w:proofErr w:type="spellEnd"/>
           </w:p>
         </w:tc>
         <w:tc>
@@ -264,7 +262,6 @@
                 <w:szCs w:val="24"/>
               </w:rPr>
             </w:pPr>
-            <w:proofErr w:type="spellStart"/>
             <w:r>
               <w:rPr>
                 <w:rFonts w:ascii="Calibri" w:hAnsi="Calibri" w:cs="Calibri"/>
@@ -273,7 +270,6 @@
               </w:rPr>
               <w:t>int</w:t>
             </w:r>
-            <w:proofErr w:type="spellEnd"/>
           </w:p>
         </w:tc>
         <w:tc>
@@ -383,7 +379,6 @@
                 <w:szCs w:val="24"/>
               </w:rPr>
             </w:pPr>
-            <w:proofErr w:type="spellStart"/>
             <w:r>
               <w:rPr>
                 <w:rFonts w:ascii="Calibri" w:hAnsi="Calibri" w:cs="Calibri"/>
@@ -392,7 +387,6 @@
               </w:rPr>
               <w:t>UserRole</w:t>
             </w:r>
-            <w:proofErr w:type="spellEnd"/>
           </w:p>
         </w:tc>
         <w:tc>
@@ -583,7 +577,6 @@
                 <w:szCs w:val="24"/>
               </w:rPr>
             </w:pPr>
-            <w:proofErr w:type="spellStart"/>
             <w:r>
               <w:rPr>
                 <w:rFonts w:ascii="Calibri" w:hAnsi="Calibri" w:cs="Calibri"/>
@@ -600,7 +593,6 @@
               </w:rPr>
               <w:t>Hash</w:t>
             </w:r>
-            <w:proofErr w:type="spellEnd"/>
           </w:p>
         </w:tc>
         <w:tc>
@@ -711,7 +703,6 @@
                 <w:szCs w:val="24"/>
               </w:rPr>
             </w:pPr>
-            <w:proofErr w:type="spellStart"/>
             <w:r>
               <w:rPr>
                 <w:rFonts w:ascii="Calibri" w:hAnsi="Calibri" w:cs="Calibri"/>
@@ -720,7 +711,6 @@
               </w:rPr>
               <w:t>FirstName</w:t>
             </w:r>
-            <w:proofErr w:type="spellEnd"/>
           </w:p>
         </w:tc>
         <w:tc>
@@ -831,7 +821,6 @@
                 <w:szCs w:val="24"/>
               </w:rPr>
             </w:pPr>
-            <w:proofErr w:type="spellStart"/>
             <w:r>
               <w:rPr>
                 <w:rFonts w:ascii="Calibri" w:hAnsi="Calibri" w:cs="Calibri"/>
@@ -840,7 +829,6 @@
               </w:rPr>
               <w:t>LastName</w:t>
             </w:r>
-            <w:proofErr w:type="spellEnd"/>
           </w:p>
         </w:tc>
         <w:tc>
@@ -959,7 +947,6 @@
                 <w:szCs w:val="24"/>
               </w:rPr>
             </w:pPr>
-            <w:proofErr w:type="spellStart"/>
             <w:r>
               <w:rPr>
                 <w:rFonts w:ascii="Calibri" w:hAnsi="Calibri" w:cs="Calibri"/>
@@ -968,7 +955,6 @@
               </w:rPr>
               <w:t>PhoneNumber</w:t>
             </w:r>
-            <w:proofErr w:type="spellEnd"/>
           </w:p>
         </w:tc>
         <w:tc>
@@ -1072,7 +1058,6 @@
                 <w:szCs w:val="24"/>
               </w:rPr>
             </w:pPr>
-            <w:proofErr w:type="spellStart"/>
             <w:r>
               <w:rPr>
                 <w:rFonts w:ascii="Calibri" w:hAnsi="Calibri" w:cs="Calibri"/>
@@ -1081,7 +1066,6 @@
               </w:rPr>
               <w:t>CreatedAt</w:t>
             </w:r>
-            <w:proofErr w:type="spellEnd"/>
           </w:p>
         </w:tc>
         <w:tc>
@@ -1099,7 +1083,6 @@
                 <w:szCs w:val="24"/>
               </w:rPr>
             </w:pPr>
-            <w:proofErr w:type="spellStart"/>
             <w:r>
               <w:rPr>
                 <w:rFonts w:ascii="Calibri" w:hAnsi="Calibri" w:cs="Calibri"/>
@@ -1108,7 +1091,6 @@
               </w:rPr>
               <w:t>Datetime</w:t>
             </w:r>
-            <w:proofErr w:type="spellEnd"/>
           </w:p>
         </w:tc>
         <w:tc>
@@ -1255,7 +1237,6 @@
                 <w:szCs w:val="24"/>
               </w:rPr>
             </w:pPr>
-            <w:proofErr w:type="spellStart"/>
             <w:r>
               <w:rPr>
                 <w:rFonts w:ascii="Calibri" w:hAnsi="Calibri" w:cs="Calibri"/>
@@ -1264,7 +1245,6 @@
               </w:rPr>
               <w:t>ClientId</w:t>
             </w:r>
-            <w:proofErr w:type="spellEnd"/>
           </w:p>
         </w:tc>
         <w:tc>
@@ -1282,7 +1262,6 @@
                 <w:szCs w:val="24"/>
               </w:rPr>
             </w:pPr>
-            <w:proofErr w:type="spellStart"/>
             <w:r>
               <w:rPr>
                 <w:rFonts w:ascii="Calibri" w:hAnsi="Calibri" w:cs="Calibri"/>
@@ -1291,7 +1270,6 @@
               </w:rPr>
               <w:t>int</w:t>
             </w:r>
-            <w:proofErr w:type="spellEnd"/>
           </w:p>
         </w:tc>
         <w:tc>
@@ -1379,7 +1357,6 @@
                 <w:szCs w:val="24"/>
               </w:rPr>
             </w:pPr>
-            <w:proofErr w:type="spellStart"/>
             <w:r>
               <w:rPr>
                 <w:rFonts w:ascii="Calibri" w:hAnsi="Calibri" w:cs="Calibri"/>
@@ -1388,7 +1365,6 @@
               </w:rPr>
               <w:t>UserId</w:t>
             </w:r>
-            <w:proofErr w:type="spellEnd"/>
           </w:p>
         </w:tc>
         <w:tc>
@@ -1403,7 +1379,6 @@
                 <w:szCs w:val="24"/>
               </w:rPr>
             </w:pPr>
-            <w:proofErr w:type="spellStart"/>
             <w:r>
               <w:rPr>
                 <w:rFonts w:ascii="Calibri" w:hAnsi="Calibri" w:cs="Calibri"/>
@@ -1412,7 +1387,6 @@
               </w:rPr>
               <w:t>int</w:t>
             </w:r>
-            <w:proofErr w:type="spellEnd"/>
           </w:p>
         </w:tc>
         <w:tc>
@@ -1493,7 +1467,6 @@
                 <w:szCs w:val="24"/>
               </w:rPr>
             </w:pPr>
-            <w:proofErr w:type="spellStart"/>
             <w:r>
               <w:rPr>
                 <w:rFonts w:ascii="Calibri" w:hAnsi="Calibri" w:cs="Calibri"/>
@@ -1502,7 +1475,6 @@
               </w:rPr>
               <w:t>PersonalCode</w:t>
             </w:r>
-            <w:proofErr w:type="spellEnd"/>
           </w:p>
         </w:tc>
         <w:tc>
@@ -1613,7 +1585,6 @@
                 <w:szCs w:val="24"/>
               </w:rPr>
             </w:pPr>
-            <w:proofErr w:type="spellStart"/>
             <w:r>
               <w:rPr>
                 <w:rFonts w:ascii="Calibri" w:hAnsi="Calibri" w:cs="Calibri"/>
@@ -1622,7 +1593,6 @@
               </w:rPr>
               <w:t>DateOfBirth</w:t>
             </w:r>
-            <w:proofErr w:type="spellEnd"/>
           </w:p>
         </w:tc>
         <w:tc>
@@ -1637,7 +1607,6 @@
                 <w:szCs w:val="24"/>
               </w:rPr>
             </w:pPr>
-            <w:proofErr w:type="spellStart"/>
             <w:r>
               <w:rPr>
                 <w:rFonts w:ascii="Calibri" w:hAnsi="Calibri" w:cs="Calibri"/>
@@ -1646,7 +1615,6 @@
               </w:rPr>
               <w:t>DateTime</w:t>
             </w:r>
-            <w:proofErr w:type="spellEnd"/>
           </w:p>
         </w:tc>
         <w:tc>
@@ -1871,7 +1839,6 @@
                 <w:szCs w:val="24"/>
               </w:rPr>
             </w:pPr>
-            <w:proofErr w:type="spellStart"/>
             <w:r>
               <w:rPr>
                 <w:rFonts w:ascii="Calibri" w:hAnsi="Calibri" w:cs="Calibri"/>
@@ -1880,7 +1847,6 @@
               </w:rPr>
               <w:t>DoctorId</w:t>
             </w:r>
-            <w:proofErr w:type="spellEnd"/>
           </w:p>
         </w:tc>
         <w:tc>
@@ -1898,7 +1864,6 @@
                 <w:szCs w:val="24"/>
               </w:rPr>
             </w:pPr>
-            <w:proofErr w:type="spellStart"/>
             <w:r>
               <w:rPr>
                 <w:rFonts w:ascii="Calibri" w:hAnsi="Calibri" w:cs="Calibri"/>
@@ -1907,7 +1872,6 @@
               </w:rPr>
               <w:t>int</w:t>
             </w:r>
-            <w:proofErr w:type="spellEnd"/>
           </w:p>
         </w:tc>
         <w:tc>
@@ -1978,8 +1942,6 @@
             </w:r>
           </w:p>
         </w:tc>
-        <w:bookmarkStart w:id="0" w:name="_GoBack"/>
-        <w:bookmarkEnd w:id="0"/>
       </w:tr>
       <w:tr>
         <w:tc>
@@ -1997,7 +1959,6 @@
                 <w:szCs w:val="24"/>
               </w:rPr>
             </w:pPr>
-            <w:proofErr w:type="spellStart"/>
             <w:r>
               <w:rPr>
                 <w:rFonts w:ascii="Calibri" w:hAnsi="Calibri" w:cs="Calibri"/>
@@ -2006,7 +1967,6 @@
               </w:rPr>
               <w:t>UserId</w:t>
             </w:r>
-            <w:proofErr w:type="spellEnd"/>
           </w:p>
         </w:tc>
         <w:tc>
@@ -2021,7 +1981,6 @@
                 <w:szCs w:val="24"/>
               </w:rPr>
             </w:pPr>
-            <w:proofErr w:type="spellStart"/>
             <w:r>
               <w:rPr>
                 <w:rFonts w:ascii="Calibri" w:hAnsi="Calibri" w:cs="Calibri"/>
@@ -2030,7 +1989,6 @@
               </w:rPr>
               <w:t>int</w:t>
             </w:r>
-            <w:proofErr w:type="spellEnd"/>
           </w:p>
         </w:tc>
         <w:tc>
@@ -2221,7 +2179,6 @@
                 <w:szCs w:val="24"/>
               </w:rPr>
             </w:pPr>
-            <w:proofErr w:type="spellStart"/>
             <w:r>
               <w:rPr>
                 <w:rFonts w:ascii="Calibri" w:hAnsi="Calibri" w:cs="Calibri"/>
@@ -2230,7 +2187,6 @@
               </w:rPr>
               <w:t>DocLicenseNum</w:t>
             </w:r>
-            <w:proofErr w:type="spellEnd"/>
           </w:p>
         </w:tc>
         <w:tc>
@@ -2341,7 +2297,6 @@
                 <w:szCs w:val="24"/>
               </w:rPr>
             </w:pPr>
-            <w:proofErr w:type="spellStart"/>
             <w:r>
               <w:rPr>
                 <w:rFonts w:ascii="Calibri" w:hAnsi="Calibri" w:cs="Calibri"/>
@@ -2350,7 +2305,6 @@
               </w:rPr>
               <w:t>WorkingHoursStart</w:t>
             </w:r>
-            <w:proofErr w:type="spellEnd"/>
           </w:p>
         </w:tc>
         <w:tc>
@@ -2365,7 +2319,6 @@
                 <w:szCs w:val="24"/>
               </w:rPr>
             </w:pPr>
-            <w:proofErr w:type="spellStart"/>
             <w:r>
               <w:rPr>
                 <w:rFonts w:ascii="Calibri" w:hAnsi="Calibri" w:cs="Calibri"/>
@@ -2374,7 +2327,6 @@
               </w:rPr>
               <w:t>TimeSpan</w:t>
             </w:r>
-            <w:proofErr w:type="spellEnd"/>
           </w:p>
         </w:tc>
         <w:tc>
@@ -2448,7 +2400,6 @@
                 <w:szCs w:val="24"/>
               </w:rPr>
             </w:pPr>
-            <w:proofErr w:type="spellStart"/>
             <w:r>
               <w:rPr>
                 <w:rFonts w:ascii="Calibri" w:hAnsi="Calibri" w:cs="Calibri"/>
@@ -2457,7 +2408,6 @@
               </w:rPr>
               <w:t>WorkingHoursEnd</w:t>
             </w:r>
-            <w:proofErr w:type="spellEnd"/>
           </w:p>
         </w:tc>
         <w:tc>
@@ -2475,7 +2425,6 @@
                 <w:szCs w:val="24"/>
               </w:rPr>
             </w:pPr>
-            <w:proofErr w:type="spellStart"/>
             <w:r>
               <w:rPr>
                 <w:rFonts w:ascii="Calibri" w:hAnsi="Calibri" w:cs="Calibri"/>
@@ -2484,7 +2433,6 @@
               </w:rPr>
               <w:t>TimeSpan</w:t>
             </w:r>
-            <w:proofErr w:type="spellEnd"/>
           </w:p>
         </w:tc>
         <w:tc>
@@ -2603,7 +2551,6 @@
                 <w:szCs w:val="24"/>
               </w:rPr>
             </w:pPr>
-            <w:proofErr w:type="spellStart"/>
             <w:r>
               <w:rPr>
                 <w:rFonts w:ascii="Calibri" w:hAnsi="Calibri" w:cs="Calibri"/>
@@ -2612,7 +2559,6 @@
               </w:rPr>
               <w:t>AdminId</w:t>
             </w:r>
-            <w:proofErr w:type="spellEnd"/>
           </w:p>
         </w:tc>
         <w:tc>
@@ -2630,7 +2576,6 @@
                 <w:szCs w:val="24"/>
               </w:rPr>
             </w:pPr>
-            <w:proofErr w:type="spellStart"/>
             <w:r>
               <w:rPr>
                 <w:rFonts w:ascii="Calibri" w:hAnsi="Calibri" w:cs="Calibri"/>
@@ -2639,7 +2584,6 @@
               </w:rPr>
               <w:t>int</w:t>
             </w:r>
-            <w:proofErr w:type="spellEnd"/>
           </w:p>
         </w:tc>
         <w:tc>
@@ -2727,7 +2671,6 @@
                 <w:szCs w:val="24"/>
               </w:rPr>
             </w:pPr>
-            <w:proofErr w:type="spellStart"/>
             <w:r>
               <w:rPr>
                 <w:rFonts w:ascii="Calibri" w:hAnsi="Calibri" w:cs="Calibri"/>
@@ -2736,7 +2679,6 @@
               </w:rPr>
               <w:t>UserId</w:t>
             </w:r>
-            <w:proofErr w:type="spellEnd"/>
           </w:p>
         </w:tc>
         <w:tc>
@@ -2751,7 +2693,6 @@
                 <w:szCs w:val="24"/>
               </w:rPr>
             </w:pPr>
-            <w:proofErr w:type="spellStart"/>
             <w:r>
               <w:rPr>
                 <w:rFonts w:ascii="Calibri" w:hAnsi="Calibri" w:cs="Calibri"/>
@@ -2760,7 +2701,6 @@
               </w:rPr>
               <w:t>int</w:t>
             </w:r>
-            <w:proofErr w:type="spellEnd"/>
           </w:p>
         </w:tc>
         <w:tc>
@@ -3029,7 +2969,6 @@
                 <w:szCs w:val="24"/>
               </w:rPr>
             </w:pPr>
-            <w:proofErr w:type="spellStart"/>
             <w:r>
               <w:rPr>
                 <w:rFonts w:ascii="Calibri" w:hAnsi="Calibri" w:cs="Calibri"/>
@@ -3038,7 +2977,6 @@
               </w:rPr>
               <w:t>AppointmentId</w:t>
             </w:r>
-            <w:proofErr w:type="spellEnd"/>
           </w:p>
         </w:tc>
         <w:tc>
@@ -3056,7 +2994,6 @@
                 <w:szCs w:val="24"/>
               </w:rPr>
             </w:pPr>
-            <w:proofErr w:type="spellStart"/>
             <w:r>
               <w:rPr>
                 <w:rFonts w:ascii="Calibri" w:hAnsi="Calibri" w:cs="Calibri"/>
@@ -3065,7 +3002,6 @@
               </w:rPr>
               <w:t>int</w:t>
             </w:r>
-            <w:proofErr w:type="spellEnd"/>
           </w:p>
         </w:tc>
         <w:tc>
@@ -3153,7 +3089,6 @@
                 <w:szCs w:val="24"/>
               </w:rPr>
             </w:pPr>
-            <w:proofErr w:type="spellStart"/>
             <w:r>
               <w:rPr>
                 <w:rFonts w:ascii="Calibri" w:hAnsi="Calibri" w:cs="Calibri"/>
@@ -3162,7 +3097,6 @@
               </w:rPr>
               <w:t>ClientId</w:t>
             </w:r>
-            <w:proofErr w:type="spellEnd"/>
           </w:p>
         </w:tc>
         <w:tc>
@@ -3177,7 +3111,6 @@
                 <w:szCs w:val="24"/>
               </w:rPr>
             </w:pPr>
-            <w:proofErr w:type="spellStart"/>
             <w:r>
               <w:rPr>
                 <w:rFonts w:ascii="Calibri" w:hAnsi="Calibri" w:cs="Calibri"/>
@@ -3186,7 +3119,6 @@
               </w:rPr>
               <w:t>int</w:t>
             </w:r>
-            <w:proofErr w:type="spellEnd"/>
           </w:p>
         </w:tc>
         <w:tc>
@@ -3259,7 +3191,6 @@
                 <w:szCs w:val="24"/>
               </w:rPr>
             </w:pPr>
-            <w:proofErr w:type="spellStart"/>
             <w:r>
               <w:rPr>
                 <w:rFonts w:ascii="Calibri" w:hAnsi="Calibri" w:cs="Calibri"/>
@@ -3268,7 +3199,6 @@
               </w:rPr>
               <w:t>DoctorId</w:t>
             </w:r>
-            <w:proofErr w:type="spellEnd"/>
           </w:p>
         </w:tc>
         <w:tc>
@@ -3283,7 +3213,6 @@
                 <w:szCs w:val="24"/>
               </w:rPr>
             </w:pPr>
-            <w:proofErr w:type="spellStart"/>
             <w:r>
               <w:rPr>
                 <w:rFonts w:ascii="Calibri" w:hAnsi="Calibri" w:cs="Calibri"/>
@@ -3292,7 +3221,6 @@
               </w:rPr>
               <w:t>int</w:t>
             </w:r>
-            <w:proofErr w:type="spellEnd"/>
           </w:p>
         </w:tc>
         <w:tc>
@@ -3365,7 +3293,6 @@
                 <w:szCs w:val="24"/>
               </w:rPr>
             </w:pPr>
-            <w:proofErr w:type="spellStart"/>
             <w:r>
               <w:rPr>
                 <w:rFonts w:ascii="Calibri" w:hAnsi="Calibri" w:cs="Calibri"/>
@@ -3374,7 +3301,6 @@
               </w:rPr>
               <w:t>AppointmentDateTime</w:t>
             </w:r>
-            <w:proofErr w:type="spellEnd"/>
           </w:p>
         </w:tc>
         <w:tc>
@@ -3389,7 +3315,6 @@
                 <w:szCs w:val="24"/>
               </w:rPr>
             </w:pPr>
-            <w:proofErr w:type="spellStart"/>
             <w:r>
               <w:rPr>
                 <w:rFonts w:ascii="Calibri" w:hAnsi="Calibri" w:cs="Calibri"/>
@@ -3398,7 +3323,6 @@
               </w:rPr>
               <w:t>DateTime</w:t>
             </w:r>
-            <w:proofErr w:type="spellEnd"/>
           </w:p>
         </w:tc>
         <w:tc>
@@ -3471,7 +3395,6 @@
                 <w:szCs w:val="24"/>
               </w:rPr>
             </w:pPr>
-            <w:proofErr w:type="spellStart"/>
             <w:r>
               <w:rPr>
                 <w:rFonts w:ascii="Calibri" w:hAnsi="Calibri" w:cs="Calibri"/>
@@ -3480,7 +3403,6 @@
               </w:rPr>
               <w:t>DurationMinutes</w:t>
             </w:r>
-            <w:proofErr w:type="spellEnd"/>
           </w:p>
         </w:tc>
         <w:tc>
@@ -3495,7 +3417,6 @@
                 <w:szCs w:val="24"/>
               </w:rPr>
             </w:pPr>
-            <w:proofErr w:type="spellStart"/>
             <w:r>
               <w:rPr>
                 <w:rFonts w:ascii="Calibri" w:hAnsi="Calibri" w:cs="Calibri"/>
@@ -3504,7 +3425,6 @@
               </w:rPr>
               <w:t>int</w:t>
             </w:r>
-            <w:proofErr w:type="spellEnd"/>
           </w:p>
         </w:tc>
         <w:tc>
@@ -3680,7 +3600,6 @@
                 <w:szCs w:val="24"/>
               </w:rPr>
             </w:pPr>
-            <w:proofErr w:type="spellStart"/>
             <w:r>
               <w:rPr>
                 <w:rFonts w:ascii="Calibri" w:hAnsi="Calibri" w:cs="Calibri"/>
@@ -3689,7 +3608,6 @@
               </w:rPr>
               <w:t>IsOutsideWorkingHours</w:t>
             </w:r>
-            <w:proofErr w:type="spellEnd"/>
           </w:p>
         </w:tc>
         <w:tc>
@@ -3886,7 +3804,6 @@
                 <w:szCs w:val="24"/>
               </w:rPr>
             </w:pPr>
-            <w:proofErr w:type="spellStart"/>
             <w:r>
               <w:rPr>
                 <w:rFonts w:ascii="Calibri" w:hAnsi="Calibri" w:cs="Calibri"/>
@@ -3895,7 +3812,6 @@
               </w:rPr>
               <w:t>CreatedAt</w:t>
             </w:r>
-            <w:proofErr w:type="spellEnd"/>
           </w:p>
         </w:tc>
         <w:tc>
@@ -3910,7 +3826,6 @@
                 <w:szCs w:val="24"/>
               </w:rPr>
             </w:pPr>
-            <w:proofErr w:type="spellStart"/>
             <w:r>
               <w:rPr>
                 <w:rFonts w:ascii="Calibri" w:hAnsi="Calibri" w:cs="Calibri"/>
@@ -3919,7 +3834,6 @@
               </w:rPr>
               <w:t>DateTime</w:t>
             </w:r>
-            <w:proofErr w:type="spellEnd"/>
           </w:p>
         </w:tc>
         <w:tc>
@@ -3993,7 +3907,6 @@
                 <w:szCs w:val="24"/>
               </w:rPr>
             </w:pPr>
-            <w:proofErr w:type="spellStart"/>
             <w:r>
               <w:rPr>
                 <w:rFonts w:ascii="Calibri" w:hAnsi="Calibri" w:cs="Calibri"/>
@@ -4002,7 +3915,6 @@
               </w:rPr>
               <w:t>CancelledAt</w:t>
             </w:r>
-            <w:proofErr w:type="spellEnd"/>
           </w:p>
         </w:tc>
         <w:tc>
@@ -4020,7 +3932,6 @@
                 <w:szCs w:val="24"/>
               </w:rPr>
             </w:pPr>
-            <w:proofErr w:type="spellStart"/>
             <w:r>
               <w:rPr>
                 <w:rFonts w:ascii="Calibri" w:hAnsi="Calibri" w:cs="Calibri"/>
@@ -4029,7 +3940,6 @@
               </w:rPr>
               <w:t>DateTime</w:t>
             </w:r>
-            <w:proofErr w:type="spellEnd"/>
           </w:p>
         </w:tc>
         <w:tc>
@@ -4120,7 +4030,6 @@
               </w:rPr>
               <w:tab/>
             </w:r>
-            <w:proofErr w:type="spellStart"/>
             <w:r>
               <w:rPr>
                 <w:rFonts w:ascii="Calibri" w:hAnsi="Calibri" w:cs="Calibri"/>
@@ -4130,7 +4039,6 @@
               </w:rPr>
               <w:t>DoctorUnavailability</w:t>
             </w:r>
-            <w:proofErr w:type="spellEnd"/>
             <w:r>
               <w:rPr>
                 <w:rFonts w:ascii="Calibri" w:hAnsi="Calibri" w:cs="Calibri"/>
@@ -4160,7 +4068,6 @@
                 <w:szCs w:val="24"/>
               </w:rPr>
             </w:pPr>
-            <w:proofErr w:type="spellStart"/>
             <w:r>
               <w:rPr>
                 <w:rFonts w:ascii="Calibri" w:hAnsi="Calibri" w:cs="Calibri"/>
@@ -4169,7 +4076,6 @@
               </w:rPr>
               <w:t>UnavailabilityId</w:t>
             </w:r>
-            <w:proofErr w:type="spellEnd"/>
           </w:p>
         </w:tc>
         <w:tc>
@@ -4187,7 +4093,6 @@
                 <w:szCs w:val="24"/>
               </w:rPr>
             </w:pPr>
-            <w:proofErr w:type="spellStart"/>
             <w:r>
               <w:rPr>
                 <w:rFonts w:ascii="Calibri" w:hAnsi="Calibri" w:cs="Calibri"/>
@@ -4196,7 +4101,6 @@
               </w:rPr>
               <w:t>int</w:t>
             </w:r>
-            <w:proofErr w:type="spellEnd"/>
           </w:p>
         </w:tc>
         <w:tc>
@@ -4284,7 +4188,6 @@
                 <w:szCs w:val="24"/>
               </w:rPr>
             </w:pPr>
-            <w:proofErr w:type="spellStart"/>
             <w:r>
               <w:rPr>
                 <w:rFonts w:ascii="Calibri" w:hAnsi="Calibri" w:cs="Calibri"/>
@@ -4293,7 +4196,6 @@
               </w:rPr>
               <w:t>DoctorId</w:t>
             </w:r>
-            <w:proofErr w:type="spellEnd"/>
           </w:p>
         </w:tc>
         <w:tc>
@@ -4308,7 +4210,6 @@
                 <w:szCs w:val="24"/>
               </w:rPr>
             </w:pPr>
-            <w:proofErr w:type="spellStart"/>
             <w:r>
               <w:rPr>
                 <w:rFonts w:ascii="Calibri" w:hAnsi="Calibri" w:cs="Calibri"/>
@@ -4317,7 +4218,6 @@
               </w:rPr>
               <w:t>int</w:t>
             </w:r>
-            <w:proofErr w:type="spellEnd"/>
           </w:p>
         </w:tc>
         <w:tc>
@@ -4390,7 +4290,6 @@
                 <w:szCs w:val="24"/>
               </w:rPr>
             </w:pPr>
-            <w:proofErr w:type="spellStart"/>
             <w:r>
               <w:rPr>
                 <w:rFonts w:ascii="Calibri" w:hAnsi="Calibri" w:cs="Calibri"/>
@@ -4400,7 +4299,6 @@
               <w:lastRenderedPageBreak/>
               <w:t>StartDate</w:t>
             </w:r>
-            <w:proofErr w:type="spellEnd"/>
           </w:p>
         </w:tc>
         <w:tc>
@@ -4415,7 +4313,6 @@
                 <w:szCs w:val="24"/>
               </w:rPr>
             </w:pPr>
-            <w:proofErr w:type="spellStart"/>
             <w:r>
               <w:rPr>
                 <w:rFonts w:ascii="Calibri" w:hAnsi="Calibri" w:cs="Calibri"/>
@@ -4424,7 +4321,6 @@
               </w:rPr>
               <w:t>DateTime</w:t>
             </w:r>
-            <w:proofErr w:type="spellEnd"/>
           </w:p>
         </w:tc>
         <w:tc>
@@ -4497,7 +4393,6 @@
                 <w:szCs w:val="24"/>
               </w:rPr>
             </w:pPr>
-            <w:proofErr w:type="spellStart"/>
             <w:r>
               <w:rPr>
                 <w:rFonts w:ascii="Calibri" w:hAnsi="Calibri" w:cs="Calibri"/>
@@ -4506,7 +4401,6 @@
               </w:rPr>
               <w:t>EndDate</w:t>
             </w:r>
-            <w:proofErr w:type="spellEnd"/>
           </w:p>
         </w:tc>
         <w:tc>
@@ -4521,7 +4415,6 @@
                 <w:szCs w:val="24"/>
               </w:rPr>
             </w:pPr>
-            <w:proofErr w:type="spellStart"/>
             <w:r>
               <w:rPr>
                 <w:rFonts w:ascii="Calibri" w:hAnsi="Calibri" w:cs="Calibri"/>
@@ -4530,7 +4423,6 @@
               </w:rPr>
               <w:t>DateTime</w:t>
             </w:r>
-            <w:proofErr w:type="spellEnd"/>
           </w:p>
         </w:tc>
         <w:tc>
@@ -4735,7 +4627,6 @@
               </w:rPr>
               <w:tab/>
             </w:r>
-            <w:proofErr w:type="spellStart"/>
             <w:r>
               <w:rPr>
                 <w:rFonts w:ascii="Calibri" w:hAnsi="Calibri" w:cs="Calibri"/>
@@ -4745,7 +4636,6 @@
               </w:rPr>
               <w:t>AppointmentDocument</w:t>
             </w:r>
-            <w:proofErr w:type="spellEnd"/>
             <w:r>
               <w:rPr>
                 <w:rFonts w:ascii="Calibri" w:hAnsi="Calibri" w:cs="Calibri"/>
@@ -4775,7 +4665,6 @@
                 <w:szCs w:val="24"/>
               </w:rPr>
             </w:pPr>
-            <w:proofErr w:type="spellStart"/>
             <w:r>
               <w:rPr>
                 <w:rFonts w:ascii="Calibri" w:hAnsi="Calibri" w:cs="Calibri"/>
@@ -4784,7 +4673,6 @@
               </w:rPr>
               <w:t>DocumentId</w:t>
             </w:r>
-            <w:proofErr w:type="spellEnd"/>
           </w:p>
         </w:tc>
         <w:tc>
@@ -4802,7 +4690,6 @@
                 <w:szCs w:val="24"/>
               </w:rPr>
             </w:pPr>
-            <w:proofErr w:type="spellStart"/>
             <w:r>
               <w:rPr>
                 <w:rFonts w:ascii="Calibri" w:hAnsi="Calibri" w:cs="Calibri"/>
@@ -4811,7 +4698,6 @@
               </w:rPr>
               <w:t>int</w:t>
             </w:r>
-            <w:proofErr w:type="spellEnd"/>
           </w:p>
         </w:tc>
         <w:tc>
@@ -4899,7 +4785,6 @@
                 <w:szCs w:val="24"/>
               </w:rPr>
             </w:pPr>
-            <w:proofErr w:type="spellStart"/>
             <w:r>
               <w:rPr>
                 <w:rFonts w:ascii="Calibri" w:hAnsi="Calibri" w:cs="Calibri"/>
@@ -4908,7 +4793,6 @@
               </w:rPr>
               <w:t>AppointmentId</w:t>
             </w:r>
-            <w:proofErr w:type="spellEnd"/>
           </w:p>
         </w:tc>
         <w:tc>
@@ -4923,7 +4807,6 @@
                 <w:szCs w:val="24"/>
               </w:rPr>
             </w:pPr>
-            <w:proofErr w:type="spellStart"/>
             <w:r>
               <w:rPr>
                 <w:rFonts w:ascii="Calibri" w:hAnsi="Calibri" w:cs="Calibri"/>
@@ -4932,7 +4815,6 @@
               </w:rPr>
               <w:t>int</w:t>
             </w:r>
-            <w:proofErr w:type="spellEnd"/>
           </w:p>
         </w:tc>
         <w:tc>
@@ -5005,7 +4887,6 @@
                 <w:szCs w:val="24"/>
               </w:rPr>
             </w:pPr>
-            <w:proofErr w:type="spellStart"/>
             <w:r>
               <w:rPr>
                 <w:rFonts w:ascii="Calibri" w:hAnsi="Calibri" w:cs="Calibri"/>
@@ -5014,7 +4895,6 @@
               </w:rPr>
               <w:t>DocumentType</w:t>
             </w:r>
-            <w:proofErr w:type="spellEnd"/>
           </w:p>
         </w:tc>
         <w:tc>
@@ -5117,7 +4997,6 @@
                 <w:szCs w:val="24"/>
               </w:rPr>
             </w:pPr>
-            <w:proofErr w:type="spellStart"/>
             <w:r>
               <w:rPr>
                 <w:rFonts w:ascii="Calibri" w:hAnsi="Calibri" w:cs="Calibri"/>
@@ -5126,7 +5005,6 @@
               </w:rPr>
               <w:t>FileName</w:t>
             </w:r>
-            <w:proofErr w:type="spellEnd"/>
           </w:p>
         </w:tc>
         <w:tc>
@@ -5229,7 +5107,6 @@
                 <w:szCs w:val="24"/>
               </w:rPr>
             </w:pPr>
-            <w:proofErr w:type="spellStart"/>
             <w:r>
               <w:rPr>
                 <w:rFonts w:ascii="Calibri" w:hAnsi="Calibri" w:cs="Calibri"/>
@@ -5238,7 +5115,6 @@
               </w:rPr>
               <w:t>FilePath</w:t>
             </w:r>
-            <w:proofErr w:type="spellEnd"/>
           </w:p>
         </w:tc>
         <w:tc>
@@ -5341,7 +5217,6 @@
                 <w:szCs w:val="24"/>
               </w:rPr>
             </w:pPr>
-            <w:proofErr w:type="spellStart"/>
             <w:r>
               <w:rPr>
                 <w:rFonts w:ascii="Calibri" w:hAnsi="Calibri" w:cs="Calibri"/>
@@ -5350,7 +5225,6 @@
               </w:rPr>
               <w:t>UploadedAt</w:t>
             </w:r>
-            <w:proofErr w:type="spellEnd"/>
           </w:p>
         </w:tc>
         <w:tc>
@@ -5365,7 +5239,6 @@
                 <w:szCs w:val="24"/>
               </w:rPr>
             </w:pPr>
-            <w:proofErr w:type="spellStart"/>
             <w:r>
               <w:rPr>
                 <w:rFonts w:ascii="Calibri" w:hAnsi="Calibri" w:cs="Calibri"/>
@@ -5374,7 +5247,6 @@
               </w:rPr>
               <w:t>DateTime</w:t>
             </w:r>
-            <w:proofErr w:type="spellEnd"/>
           </w:p>
         </w:tc>
         <w:tc>
@@ -5448,7 +5320,6 @@
                 <w:szCs w:val="24"/>
               </w:rPr>
             </w:pPr>
-            <w:proofErr w:type="spellStart"/>
             <w:r>
               <w:rPr>
                 <w:rFonts w:ascii="Calibri" w:hAnsi="Calibri" w:cs="Calibri"/>
@@ -5457,7 +5328,6 @@
               </w:rPr>
               <w:t>FileSize</w:t>
             </w:r>
-            <w:proofErr w:type="spellEnd"/>
           </w:p>
         </w:tc>
         <w:tc>
@@ -5619,7 +5489,6 @@
                 <w:szCs w:val="24"/>
               </w:rPr>
             </w:pPr>
-            <w:proofErr w:type="spellStart"/>
             <w:r>
               <w:rPr>
                 <w:rFonts w:ascii="Calibri" w:hAnsi="Calibri" w:cs="Calibri"/>
@@ -5628,7 +5497,6 @@
               </w:rPr>
               <w:t>InvoiceId</w:t>
             </w:r>
-            <w:proofErr w:type="spellEnd"/>
           </w:p>
         </w:tc>
         <w:tc>
@@ -5646,7 +5514,6 @@
                 <w:szCs w:val="24"/>
               </w:rPr>
             </w:pPr>
-            <w:proofErr w:type="spellStart"/>
             <w:r>
               <w:rPr>
                 <w:rFonts w:ascii="Calibri" w:hAnsi="Calibri" w:cs="Calibri"/>
@@ -5655,7 +5522,6 @@
               </w:rPr>
               <w:t>int</w:t>
             </w:r>
-            <w:proofErr w:type="spellEnd"/>
           </w:p>
         </w:tc>
         <w:tc>
@@ -5743,7 +5609,6 @@
                 <w:szCs w:val="24"/>
               </w:rPr>
             </w:pPr>
-            <w:proofErr w:type="spellStart"/>
             <w:r>
               <w:rPr>
                 <w:rFonts w:ascii="Calibri" w:hAnsi="Calibri" w:cs="Calibri"/>
@@ -5752,7 +5617,6 @@
               </w:rPr>
               <w:t>AppointmentId</w:t>
             </w:r>
-            <w:proofErr w:type="spellEnd"/>
           </w:p>
         </w:tc>
         <w:tc>
@@ -5767,7 +5631,6 @@
                 <w:szCs w:val="24"/>
               </w:rPr>
             </w:pPr>
-            <w:proofErr w:type="spellStart"/>
             <w:r>
               <w:rPr>
                 <w:rFonts w:ascii="Calibri" w:hAnsi="Calibri" w:cs="Calibri"/>
@@ -5776,7 +5639,6 @@
               </w:rPr>
               <w:t>int</w:t>
             </w:r>
-            <w:proofErr w:type="spellEnd"/>
           </w:p>
         </w:tc>
         <w:tc>
@@ -5857,7 +5719,6 @@
                 <w:szCs w:val="24"/>
               </w:rPr>
             </w:pPr>
-            <w:proofErr w:type="spellStart"/>
             <w:r>
               <w:rPr>
                 <w:rFonts w:ascii="Calibri" w:hAnsi="Calibri" w:cs="Calibri"/>
@@ -5866,7 +5727,6 @@
               </w:rPr>
               <w:t>InvoiceDate</w:t>
             </w:r>
-            <w:proofErr w:type="spellEnd"/>
           </w:p>
         </w:tc>
         <w:tc>
@@ -5881,7 +5741,6 @@
                 <w:szCs w:val="24"/>
               </w:rPr>
             </w:pPr>
-            <w:proofErr w:type="spellStart"/>
             <w:r>
               <w:rPr>
                 <w:rFonts w:ascii="Calibri" w:hAnsi="Calibri" w:cs="Calibri"/>
@@ -5890,7 +5749,6 @@
               </w:rPr>
               <w:t>DateTime</w:t>
             </w:r>
-            <w:proofErr w:type="spellEnd"/>
           </w:p>
         </w:tc>
         <w:tc>
@@ -5963,7 +5821,6 @@
                 <w:szCs w:val="24"/>
               </w:rPr>
             </w:pPr>
-            <w:proofErr w:type="spellStart"/>
             <w:r>
               <w:rPr>
                 <w:rFonts w:ascii="Calibri" w:hAnsi="Calibri" w:cs="Calibri"/>
@@ -5972,7 +5829,6 @@
               </w:rPr>
               <w:t>DueDate</w:t>
             </w:r>
-            <w:proofErr w:type="spellEnd"/>
           </w:p>
         </w:tc>
         <w:tc>
@@ -5987,7 +5843,6 @@
                 <w:szCs w:val="24"/>
               </w:rPr>
             </w:pPr>
-            <w:proofErr w:type="spellStart"/>
             <w:r>
               <w:rPr>
                 <w:rFonts w:ascii="Calibri" w:hAnsi="Calibri" w:cs="Calibri"/>
@@ -5996,7 +5851,6 @@
               </w:rPr>
               <w:t>DateTime</w:t>
             </w:r>
-            <w:proofErr w:type="spellEnd"/>
           </w:p>
         </w:tc>
         <w:tc>
@@ -6069,7 +5923,6 @@
                 <w:szCs w:val="24"/>
               </w:rPr>
             </w:pPr>
-            <w:proofErr w:type="spellStart"/>
             <w:r>
               <w:rPr>
                 <w:rFonts w:ascii="Calibri" w:hAnsi="Calibri" w:cs="Calibri"/>
@@ -6078,7 +5931,6 @@
               </w:rPr>
               <w:t>TotalBeforeVat</w:t>
             </w:r>
-            <w:proofErr w:type="spellEnd"/>
           </w:p>
         </w:tc>
         <w:tc>
@@ -6181,7 +6033,6 @@
                 <w:szCs w:val="24"/>
               </w:rPr>
             </w:pPr>
-            <w:proofErr w:type="spellStart"/>
             <w:r>
               <w:rPr>
                 <w:rFonts w:ascii="Calibri" w:hAnsi="Calibri" w:cs="Calibri"/>
@@ -6190,7 +6041,6 @@
               </w:rPr>
               <w:t>TotalWithVat</w:t>
             </w:r>
-            <w:proofErr w:type="spellEnd"/>
           </w:p>
         </w:tc>
         <w:tc>
@@ -6293,7 +6143,6 @@
                 <w:szCs w:val="24"/>
               </w:rPr>
             </w:pPr>
-            <w:proofErr w:type="spellStart"/>
             <w:r>
               <w:rPr>
                 <w:rFonts w:ascii="Calibri" w:hAnsi="Calibri" w:cs="Calibri"/>
@@ -6302,7 +6151,6 @@
               </w:rPr>
               <w:t>IsPaid</w:t>
             </w:r>
-            <w:proofErr w:type="spellEnd"/>
           </w:p>
         </w:tc>
         <w:tc>
@@ -6397,7 +6245,6 @@
                 <w:szCs w:val="24"/>
               </w:rPr>
             </w:pPr>
-            <w:proofErr w:type="spellStart"/>
             <w:r>
               <w:rPr>
                 <w:rFonts w:ascii="Calibri" w:hAnsi="Calibri" w:cs="Calibri"/>
@@ -6406,7 +6253,6 @@
               </w:rPr>
               <w:t>PaidAt</w:t>
             </w:r>
-            <w:proofErr w:type="spellEnd"/>
           </w:p>
         </w:tc>
         <w:tc>
@@ -6421,7 +6267,6 @@
                 <w:szCs w:val="24"/>
               </w:rPr>
             </w:pPr>
-            <w:proofErr w:type="spellStart"/>
             <w:r>
               <w:rPr>
                 <w:rFonts w:ascii="Calibri" w:hAnsi="Calibri" w:cs="Calibri"/>
@@ -6430,7 +6275,6 @@
               </w:rPr>
               <w:t>DateTime</w:t>
             </w:r>
-            <w:proofErr w:type="spellEnd"/>
           </w:p>
         </w:tc>
         <w:tc>
@@ -6496,7 +6340,6 @@
                 <w:szCs w:val="24"/>
               </w:rPr>
             </w:pPr>
-            <w:proofErr w:type="spellStart"/>
             <w:r>
               <w:rPr>
                 <w:rFonts w:ascii="Calibri" w:hAnsi="Calibri" w:cs="Calibri"/>
@@ -6505,7 +6348,6 @@
               </w:rPr>
               <w:t>InvoiceNum</w:t>
             </w:r>
-            <w:proofErr w:type="spellEnd"/>
           </w:p>
         </w:tc>
         <w:tc>
@@ -6654,7 +6496,6 @@
               </w:rPr>
               <w:tab/>
             </w:r>
-            <w:proofErr w:type="spellStart"/>
             <w:r>
               <w:rPr>
                 <w:rFonts w:ascii="Calibri" w:hAnsi="Calibri" w:cs="Calibri"/>
@@ -6664,7 +6505,6 @@
               </w:rPr>
               <w:t>Invoicerow</w:t>
             </w:r>
-            <w:proofErr w:type="spellEnd"/>
           </w:p>
         </w:tc>
       </w:tr>
@@ -6685,7 +6525,6 @@
                 <w:szCs w:val="24"/>
               </w:rPr>
             </w:pPr>
-            <w:proofErr w:type="spellStart"/>
             <w:r>
               <w:rPr>
                 <w:rFonts w:ascii="Calibri" w:hAnsi="Calibri" w:cs="Calibri"/>
@@ -6694,7 +6533,6 @@
               </w:rPr>
               <w:t>InvoiceRowId</w:t>
             </w:r>
-            <w:proofErr w:type="spellEnd"/>
           </w:p>
         </w:tc>
         <w:tc>
@@ -6712,7 +6550,6 @@
                 <w:szCs w:val="24"/>
               </w:rPr>
             </w:pPr>
-            <w:proofErr w:type="spellStart"/>
             <w:r>
               <w:rPr>
                 <w:rFonts w:ascii="Calibri" w:hAnsi="Calibri" w:cs="Calibri"/>
@@ -6721,7 +6558,6 @@
               </w:rPr>
               <w:t>int</w:t>
             </w:r>
-            <w:proofErr w:type="spellEnd"/>
           </w:p>
         </w:tc>
         <w:tc>
@@ -6809,7 +6645,6 @@
                 <w:szCs w:val="24"/>
               </w:rPr>
             </w:pPr>
-            <w:proofErr w:type="spellStart"/>
             <w:r>
               <w:rPr>
                 <w:rFonts w:ascii="Calibri" w:hAnsi="Calibri" w:cs="Calibri"/>
@@ -6818,7 +6653,6 @@
               </w:rPr>
               <w:t>InvoiceId</w:t>
             </w:r>
-            <w:proofErr w:type="spellEnd"/>
           </w:p>
         </w:tc>
         <w:tc>
@@ -6833,7 +6667,6 @@
                 <w:szCs w:val="24"/>
               </w:rPr>
             </w:pPr>
-            <w:proofErr w:type="spellStart"/>
             <w:r>
               <w:rPr>
                 <w:rFonts w:ascii="Calibri" w:hAnsi="Calibri" w:cs="Calibri"/>
@@ -6842,7 +6675,6 @@
               </w:rPr>
               <w:t>int</w:t>
             </w:r>
-            <w:proofErr w:type="spellEnd"/>
           </w:p>
         </w:tc>
         <w:tc>
@@ -6915,7 +6747,6 @@
                 <w:szCs w:val="24"/>
               </w:rPr>
             </w:pPr>
-            <w:proofErr w:type="spellStart"/>
             <w:r>
               <w:rPr>
                 <w:rFonts w:ascii="Calibri" w:hAnsi="Calibri" w:cs="Calibri"/>
@@ -6924,7 +6755,6 @@
               </w:rPr>
               <w:t>ServiceDescription</w:t>
             </w:r>
-            <w:proofErr w:type="spellEnd"/>
           </w:p>
         </w:tc>
         <w:tc>
@@ -6961,6 +6791,14 @@
                 <w:szCs w:val="24"/>
               </w:rPr>
             </w:pPr>
+            <w:r>
+              <w:rPr>
+                <w:rFonts w:ascii="Calibri" w:hAnsi="Calibri" w:cs="Calibri"/>
+                <w:sz w:val="24"/>
+                <w:szCs w:val="24"/>
+              </w:rPr>
+              <w:t xml:space="preserve">3 - </w:t>
+            </w:r>
             <w:r>
               <w:rPr>
                 <w:rFonts w:ascii="Calibri" w:hAnsi="Calibri" w:cs="Calibri"/>
@@ -7079,6 +6917,17 @@
               </w:rPr>
               <w:t>10,2</w:t>
             </w:r>
+            <w:r>
+              <w:rPr>
+                <w:rFonts w:ascii="Calibri" w:hAnsi="Calibri" w:cs="Calibri"/>
+                <w:sz w:val="24"/>
+                <w:szCs w:val="24"/>
+              </w:rPr>
+              <w:br/>
+              <w:t>1 - 10000</w:t>
+            </w:r>
+            <w:bookmarkStart w:id="0" w:name="_GoBack"/>
+            <w:bookmarkEnd w:id="0"/>
           </w:p>
         </w:tc>
         <w:tc>
@@ -7159,7 +7008,6 @@
                 <w:szCs w:val="24"/>
               </w:rPr>
             </w:pPr>
-            <w:proofErr w:type="spellStart"/>
             <w:r>
               <w:rPr>
                 <w:rFonts w:ascii="Calibri" w:hAnsi="Calibri" w:cs="Calibri"/>
@@ -7168,7 +7016,6 @@
               </w:rPr>
               <w:t>int</w:t>
             </w:r>
-            <w:proofErr w:type="spellEnd"/>
           </w:p>
         </w:tc>
         <w:tc>
@@ -7307,6 +7154,23 @@
                 <w:szCs w:val="24"/>
               </w:rPr>
               <w:t>10,2</w:t>
+            </w:r>
+            <w:r>
+              <w:rPr>
+                <w:rFonts w:ascii="Calibri" w:hAnsi="Calibri" w:cs="Calibri"/>
+                <w:sz w:val="24"/>
+                <w:szCs w:val="24"/>
+              </w:rPr>
+              <w:br/>
+              <w:t>0 - 99999</w:t>
+            </w:r>
+            <w:r>
+              <w:rPr>
+                <w:rFonts w:ascii="Calibri" w:hAnsi="Calibri" w:cs="Calibri"/>
+                <w:sz w:val="24"/>
+                <w:szCs w:val="24"/>
+              </w:rPr>
+              <w:br/>
             </w:r>
           </w:p>
         </w:tc>
@@ -7433,8 +7297,8 @@
                 <w:szCs w:val="24"/>
               </w:rPr>
               <w:tab/>
-            </w:r>
-            <w:proofErr w:type="spellStart"/>
+              <w:t>User</w:t>
+            </w:r>
             <w:r>
               <w:rPr>
                 <w:rFonts w:ascii="Calibri" w:hAnsi="Calibri" w:cs="Calibri"/>
@@ -7442,18 +7306,8 @@
                 <w:sz w:val="24"/>
                 <w:szCs w:val="24"/>
               </w:rPr>
-              <w:t>User</w:t>
-            </w:r>
-            <w:r>
-              <w:rPr>
-                <w:rFonts w:ascii="Calibri" w:hAnsi="Calibri" w:cs="Calibri"/>
-                <w:b/>
-                <w:sz w:val="24"/>
-                <w:szCs w:val="24"/>
-              </w:rPr>
               <w:t>Role</w:t>
             </w:r>
-            <w:proofErr w:type="spellEnd"/>
             <w:r>
               <w:rPr>
                 <w:rFonts w:ascii="Calibri" w:hAnsi="Calibri" w:cs="Calibri"/>
@@ -7595,7 +7449,6 @@
               </w:rPr>
               <w:tab/>
             </w:r>
-            <w:proofErr w:type="spellStart"/>
             <w:r>
               <w:rPr>
                 <w:rFonts w:ascii="Calibri" w:hAnsi="Calibri" w:cs="Calibri"/>
@@ -7605,7 +7458,6 @@
               </w:rPr>
               <w:t>AppointmentStatus</w:t>
             </w:r>
-            <w:proofErr w:type="spellEnd"/>
             <w:r>
               <w:rPr>
                 <w:rFonts w:ascii="Calibri" w:hAnsi="Calibri" w:cs="Calibri"/>
@@ -7720,16 +7572,15 @@
                 <w:szCs w:val="24"/>
               </w:rPr>
             </w:pPr>
-            <w:proofErr w:type="spellStart"/>
-            <w:r>
-              <w:rPr>
-                <w:rFonts w:ascii="Calibri" w:hAnsi="Calibri" w:cs="Calibri"/>
-                <w:sz w:val="24"/>
-                <w:szCs w:val="24"/>
-              </w:rPr>
+            <w:r>
+              <w:rPr>
+                <w:rFonts w:ascii="Calibri" w:hAnsi="Calibri" w:cs="Calibri"/>
+                <w:sz w:val="24"/>
+                <w:szCs w:val="24"/>
+              </w:rPr>
+              <w:lastRenderedPageBreak/>
               <w:t>NoShow</w:t>
             </w:r>
-            <w:proofErr w:type="spellEnd"/>
           </w:p>
         </w:tc>
       </w:tr>
@@ -7755,7 +7606,6 @@
         <w:rPr>
           <w:noProof/>
         </w:rPr>
-        <w:lastRenderedPageBreak/>
         <w:t>Reeglid</w:t>
       </w:r>
     </w:p>
@@ -7782,307 +7632,8 @@
           <w:numId w:val="1"/>
         </w:numPr>
       </w:pPr>
-      <w:proofErr w:type="spellStart"/>
       <w:r>
-        <w:t>Arvel</w:t>
-      </w:r>
-      <w:proofErr w:type="spellEnd"/>
-      <w:r>
-        <w:t xml:space="preserve"> </w:t>
-      </w:r>
-      <w:proofErr w:type="spellStart"/>
-      <w:r>
-        <w:t>DueDate</w:t>
-      </w:r>
-      <w:proofErr w:type="spellEnd"/>
-      <w:r>
-        <w:t xml:space="preserve"> </w:t>
-      </w:r>
-      <w:proofErr w:type="spellStart"/>
-      <w:r>
-        <w:t>peab</w:t>
-      </w:r>
-      <w:proofErr w:type="spellEnd"/>
-      <w:r>
-        <w:t xml:space="preserve"> </w:t>
-      </w:r>
-      <w:proofErr w:type="spellStart"/>
-      <w:r>
-        <w:t>olema</w:t>
-      </w:r>
-      <w:proofErr w:type="spellEnd"/>
-      <w:r>
-        <w:t xml:space="preserve"> </w:t>
-      </w:r>
-      <w:proofErr w:type="spellStart"/>
-      <w:r>
-        <w:t>suurem</w:t>
-      </w:r>
-      <w:proofErr w:type="spellEnd"/>
-      <w:r>
-        <w:t xml:space="preserve"> </w:t>
-      </w:r>
-      <w:proofErr w:type="spellStart"/>
-      <w:r>
-        <w:t>ehk</w:t>
-      </w:r>
-      <w:proofErr w:type="spellEnd"/>
-      <w:r>
-        <w:t xml:space="preserve"> </w:t>
-      </w:r>
-      <w:proofErr w:type="spellStart"/>
-      <w:proofErr w:type="gramStart"/>
-      <w:r>
-        <w:t>peale</w:t>
-      </w:r>
-      <w:proofErr w:type="spellEnd"/>
-      <w:proofErr w:type="gramEnd"/>
-      <w:r>
-        <w:t xml:space="preserve"> </w:t>
-      </w:r>
-      <w:proofErr w:type="spellStart"/>
-      <w:r>
-        <w:t>InvoiceDate-i</w:t>
-      </w:r>
-      <w:proofErr w:type="spellEnd"/>
-      <w:r>
-        <w:t>.</w:t>
-      </w:r>
-    </w:p>
-    <w:p>
-      <w:pPr>
-        <w:pStyle w:val="ListParagraph"/>
-        <w:numPr>
-          <w:ilvl w:val="0"/>
-          <w:numId w:val="1"/>
-        </w:numPr>
-      </w:pPr>
-      <w:proofErr w:type="spellStart"/>
-      <w:r>
-        <w:t>Ei</w:t>
-      </w:r>
-      <w:proofErr w:type="spellEnd"/>
-      <w:r>
-        <w:t xml:space="preserve"> </w:t>
-      </w:r>
-      <w:proofErr w:type="spellStart"/>
-      <w:r>
-        <w:t>tohi</w:t>
-      </w:r>
-      <w:proofErr w:type="spellEnd"/>
-      <w:r>
-        <w:t xml:space="preserve"> olla </w:t>
-      </w:r>
-      <w:proofErr w:type="spellStart"/>
-      <w:r>
-        <w:t>topeltbroneeringudi</w:t>
-      </w:r>
-      <w:proofErr w:type="spellEnd"/>
-      <w:r>
-        <w:t xml:space="preserve"> </w:t>
-      </w:r>
-      <w:proofErr w:type="spellStart"/>
-      <w:r>
-        <w:t>ehk</w:t>
-      </w:r>
-      <w:proofErr w:type="spellEnd"/>
-      <w:r>
-        <w:t xml:space="preserve"> </w:t>
-      </w:r>
-      <w:proofErr w:type="spellStart"/>
-      <w:r>
-        <w:t>üks</w:t>
-      </w:r>
-      <w:proofErr w:type="spellEnd"/>
-      <w:r>
-        <w:t xml:space="preserve"> </w:t>
-      </w:r>
-      <w:proofErr w:type="spellStart"/>
-      <w:r>
-        <w:t>arst</w:t>
-      </w:r>
-      <w:proofErr w:type="spellEnd"/>
-      <w:r>
-        <w:t xml:space="preserve"> </w:t>
-      </w:r>
-      <w:proofErr w:type="gramStart"/>
-      <w:r>
-        <w:t>ja</w:t>
-      </w:r>
-      <w:proofErr w:type="gramEnd"/>
-      <w:r>
-        <w:t xml:space="preserve"> </w:t>
-      </w:r>
-      <w:proofErr w:type="spellStart"/>
-      <w:r>
-        <w:t>klient</w:t>
-      </w:r>
-      <w:proofErr w:type="spellEnd"/>
-      <w:r>
-        <w:t xml:space="preserve"> </w:t>
-      </w:r>
-      <w:proofErr w:type="spellStart"/>
-      <w:r>
-        <w:t>saab</w:t>
-      </w:r>
-      <w:proofErr w:type="spellEnd"/>
-      <w:r>
-        <w:t xml:space="preserve"> olla </w:t>
-      </w:r>
-      <w:proofErr w:type="spellStart"/>
-      <w:r>
-        <w:t>samal</w:t>
-      </w:r>
-      <w:proofErr w:type="spellEnd"/>
-      <w:r>
-        <w:t xml:space="preserve"> </w:t>
-      </w:r>
-      <w:proofErr w:type="spellStart"/>
-      <w:r>
-        <w:t>ajahetkel</w:t>
-      </w:r>
-      <w:proofErr w:type="spellEnd"/>
-      <w:r>
-        <w:t xml:space="preserve"> </w:t>
-      </w:r>
-      <w:proofErr w:type="spellStart"/>
-      <w:r>
-        <w:t>seotud</w:t>
-      </w:r>
-      <w:proofErr w:type="spellEnd"/>
-      <w:r>
-        <w:t xml:space="preserve"> </w:t>
-      </w:r>
-      <w:proofErr w:type="spellStart"/>
-      <w:r>
-        <w:t>ainult</w:t>
-      </w:r>
-      <w:proofErr w:type="spellEnd"/>
-      <w:r>
-        <w:t xml:space="preserve"> </w:t>
-      </w:r>
-      <w:proofErr w:type="spellStart"/>
-      <w:r>
-        <w:t>ühe</w:t>
-      </w:r>
-      <w:proofErr w:type="spellEnd"/>
-      <w:r>
-        <w:t xml:space="preserve"> </w:t>
-      </w:r>
-      <w:proofErr w:type="spellStart"/>
-      <w:r>
-        <w:t>broneeringuga</w:t>
-      </w:r>
-      <w:proofErr w:type="spellEnd"/>
-      <w:r>
-        <w:t>.</w:t>
-      </w:r>
-    </w:p>
-    <w:p>
-      <w:pPr>
-        <w:pStyle w:val="ListParagraph"/>
-        <w:numPr>
-          <w:ilvl w:val="0"/>
-          <w:numId w:val="1"/>
-        </w:numPr>
-      </w:pPr>
-      <w:proofErr w:type="spellStart"/>
-      <w:r>
-        <w:t>Arvel</w:t>
-      </w:r>
-      <w:proofErr w:type="spellEnd"/>
-      <w:r>
-        <w:t xml:space="preserve"> </w:t>
-      </w:r>
-      <w:proofErr w:type="spellStart"/>
-      <w:r>
-        <w:t>TotalWithVat</w:t>
-      </w:r>
-      <w:proofErr w:type="spellEnd"/>
-      <w:r>
-        <w:t xml:space="preserve"> </w:t>
-      </w:r>
-      <w:proofErr w:type="spellStart"/>
-      <w:r>
-        <w:t>peab</w:t>
-      </w:r>
-      <w:proofErr w:type="spellEnd"/>
-      <w:r>
-        <w:t xml:space="preserve"> </w:t>
-      </w:r>
-      <w:proofErr w:type="spellStart"/>
-      <w:r>
-        <w:t>olema</w:t>
-      </w:r>
-      <w:proofErr w:type="spellEnd"/>
-      <w:r>
-        <w:t xml:space="preserve"> </w:t>
-      </w:r>
-      <w:proofErr w:type="spellStart"/>
-      <w:r>
-        <w:t>suurem</w:t>
-      </w:r>
-      <w:proofErr w:type="spellEnd"/>
-      <w:r>
-        <w:t xml:space="preserve"> </w:t>
-      </w:r>
-      <w:proofErr w:type="spellStart"/>
-      <w:r>
-        <w:t>kui</w:t>
-      </w:r>
-      <w:proofErr w:type="spellEnd"/>
-      <w:r>
-        <w:t xml:space="preserve"> </w:t>
-      </w:r>
-      <w:proofErr w:type="spellStart"/>
-      <w:r>
-        <w:t>TotalBeforeVat</w:t>
-      </w:r>
-      <w:proofErr w:type="spellEnd"/>
-      <w:r>
-        <w:t xml:space="preserve"> (Vat-</w:t>
-      </w:r>
-      <w:proofErr w:type="spellStart"/>
-      <w:r>
-        <w:t>i</w:t>
-      </w:r>
-      <w:proofErr w:type="spellEnd"/>
-      <w:r>
-        <w:t xml:space="preserve"> </w:t>
-      </w:r>
-      <w:proofErr w:type="spellStart"/>
-      <w:proofErr w:type="gramStart"/>
-      <w:r>
-        <w:t>saab</w:t>
-      </w:r>
-      <w:proofErr w:type="spellEnd"/>
-      <w:proofErr w:type="gramEnd"/>
-      <w:r>
-        <w:t xml:space="preserve"> </w:t>
-      </w:r>
-      <w:proofErr w:type="spellStart"/>
-      <w:r>
-        <w:t>määrata</w:t>
-      </w:r>
-      <w:proofErr w:type="spellEnd"/>
-      <w:r>
-        <w:t xml:space="preserve"> </w:t>
-      </w:r>
-      <w:proofErr w:type="spellStart"/>
-      <w:r>
-        <w:t>konstantse</w:t>
-      </w:r>
-      <w:proofErr w:type="spellEnd"/>
-      <w:r>
-        <w:t xml:space="preserve"> </w:t>
-      </w:r>
-      <w:proofErr w:type="spellStart"/>
-      <w:r>
-        <w:t>suurusena</w:t>
-      </w:r>
-      <w:proofErr w:type="spellEnd"/>
-      <w:r>
-        <w:t>)</w:t>
+        <w:t>Arvel DueDate peab olema suurem ehk peale InvoiceDate-i</w:t>
       </w:r>
       <w:r>
         <w:t>.</w:t>
@@ -8096,43 +7647,15 @@
           <w:numId w:val="1"/>
         </w:numPr>
       </w:pPr>
-      <w:proofErr w:type="spellStart"/>
       <w:r>
-        <w:t>Makstud</w:t>
+        <w:t xml:space="preserve">Ei </w:t>
       </w:r>
-      <w:proofErr w:type="spellEnd"/>
       <w:r>
-        <w:t xml:space="preserve"> </w:t>
+        <w:t>tohi olla topeltbroneeringuid ehk üks arst ja klient saavad</w:t>
       </w:r>
-      <w:proofErr w:type="spellStart"/>
       <w:r>
-        <w:t>arvet</w:t>
+        <w:t xml:space="preserve"> olla samal ajahetkel seotud ainult ühe broneeringuga</w:t>
       </w:r>
-      <w:proofErr w:type="spellEnd"/>
-      <w:r>
-        <w:t xml:space="preserve"> </w:t>
-      </w:r>
-      <w:proofErr w:type="spellStart"/>
-      <w:r>
-        <w:t>ei</w:t>
-      </w:r>
-      <w:proofErr w:type="spellEnd"/>
-      <w:r>
-        <w:t xml:space="preserve"> </w:t>
-      </w:r>
-      <w:proofErr w:type="spellStart"/>
-      <w:r>
-        <w:t>saa</w:t>
-      </w:r>
-      <w:proofErr w:type="spellEnd"/>
-      <w:r>
-        <w:t xml:space="preserve"> </w:t>
-      </w:r>
-      <w:proofErr w:type="spellStart"/>
-      <w:r>
-        <w:t>muuta</w:t>
-      </w:r>
-      <w:proofErr w:type="spellEnd"/>
       <w:r>
         <w:t>.</w:t>
       </w:r>
@@ -8145,152 +7668,9 @@
           <w:numId w:val="1"/>
         </w:numPr>
       </w:pPr>
-      <w:proofErr w:type="spellStart"/>
       <w:r>
-        <w:t>Broneeringul</w:t>
+        <w:t>Arvel TotalWithVat peab olema suurem kui TotalBeforeVat (Vat-i saab määrata konstantse suurusena)</w:t>
       </w:r>
-      <w:proofErr w:type="spellEnd"/>
-      <w:r>
-        <w:t xml:space="preserve"> </w:t>
-      </w:r>
-      <w:proofErr w:type="spellStart"/>
-      <w:r>
-        <w:t>kindel</w:t>
-      </w:r>
-      <w:proofErr w:type="spellEnd"/>
-      <w:r>
-        <w:t xml:space="preserve"> default </w:t>
-      </w:r>
-      <w:proofErr w:type="spellStart"/>
-      <w:r>
-        <w:t>kestvus</w:t>
-      </w:r>
-      <w:proofErr w:type="spellEnd"/>
-      <w:r>
-        <w:t xml:space="preserve">, </w:t>
-      </w:r>
-      <w:proofErr w:type="spellStart"/>
-      <w:r>
-        <w:t>hetkel</w:t>
-      </w:r>
-      <w:proofErr w:type="spellEnd"/>
-      <w:r>
-        <w:t xml:space="preserve"> 30min</w:t>
-      </w:r>
-      <w:r>
-        <w:t xml:space="preserve">. </w:t>
-      </w:r>
-      <w:proofErr w:type="spellStart"/>
-      <w:r>
-        <w:t>Broneeringu</w:t>
-      </w:r>
-      <w:proofErr w:type="spellEnd"/>
-      <w:r>
-        <w:t xml:space="preserve"> </w:t>
-      </w:r>
-      <w:proofErr w:type="spellStart"/>
-      <w:r>
-        <w:t>kestvust</w:t>
-      </w:r>
-      <w:proofErr w:type="spellEnd"/>
-      <w:r>
-        <w:t xml:space="preserve"> </w:t>
-      </w:r>
-      <w:proofErr w:type="spellStart"/>
-      <w:proofErr w:type="gramStart"/>
-      <w:r>
-        <w:t>saab</w:t>
-      </w:r>
-      <w:proofErr w:type="spellEnd"/>
-      <w:proofErr w:type="gramEnd"/>
-      <w:r>
-        <w:t xml:space="preserve"> </w:t>
-      </w:r>
-      <w:proofErr w:type="spellStart"/>
-      <w:r>
-        <w:t>pikemaks</w:t>
-      </w:r>
-      <w:proofErr w:type="spellEnd"/>
-      <w:r>
-        <w:t xml:space="preserve"> </w:t>
-      </w:r>
-      <w:proofErr w:type="spellStart"/>
-      <w:r>
-        <w:t>muuta</w:t>
-      </w:r>
-      <w:proofErr w:type="spellEnd"/>
-      <w:r>
-        <w:t xml:space="preserve"> </w:t>
-      </w:r>
-      <w:proofErr w:type="spellStart"/>
-      <w:r>
-        <w:t>vaid</w:t>
-      </w:r>
-      <w:proofErr w:type="spellEnd"/>
-      <w:r>
-        <w:t xml:space="preserve"> administrator ja </w:t>
-      </w:r>
-      <w:proofErr w:type="spellStart"/>
-      <w:r>
-        <w:t>seda</w:t>
-      </w:r>
-      <w:proofErr w:type="spellEnd"/>
-      <w:r>
-        <w:t xml:space="preserve"> </w:t>
-      </w:r>
-      <w:proofErr w:type="spellStart"/>
-      <w:r>
-        <w:t>järgnevate</w:t>
-      </w:r>
-      <w:proofErr w:type="spellEnd"/>
-      <w:r>
-        <w:t xml:space="preserve"> </w:t>
-      </w:r>
-      <w:proofErr w:type="spellStart"/>
-      <w:r>
-        <w:t>aegade</w:t>
-      </w:r>
-      <w:proofErr w:type="spellEnd"/>
-      <w:r>
-        <w:t xml:space="preserve"> </w:t>
-      </w:r>
-      <w:proofErr w:type="spellStart"/>
-      <w:r>
-        <w:t>arvelt</w:t>
-      </w:r>
-      <w:proofErr w:type="spellEnd"/>
-      <w:r>
-        <w:t xml:space="preserve"> </w:t>
-      </w:r>
-      <w:proofErr w:type="spellStart"/>
-      <w:r>
-        <w:t>ehk</w:t>
-      </w:r>
-      <w:proofErr w:type="spellEnd"/>
-      <w:r>
-        <w:t xml:space="preserve"> 30min </w:t>
-      </w:r>
-      <w:proofErr w:type="spellStart"/>
-      <w:r>
-        <w:t>saab</w:t>
-      </w:r>
-      <w:proofErr w:type="spellEnd"/>
-      <w:r>
-        <w:t xml:space="preserve"> </w:t>
-      </w:r>
-      <w:proofErr w:type="spellStart"/>
-      <w:r>
-        <w:t>muuta</w:t>
-      </w:r>
-      <w:proofErr w:type="spellEnd"/>
-      <w:r>
-        <w:t xml:space="preserve"> 1h-ks </w:t>
-      </w:r>
-      <w:proofErr w:type="spellStart"/>
-      <w:r>
-        <w:t>jne</w:t>
-      </w:r>
-      <w:proofErr w:type="spellEnd"/>
       <w:r>
         <w:t>.</w:t>
       </w:r>
@@ -8303,93 +7683,39 @@
           <w:numId w:val="1"/>
         </w:numPr>
       </w:pPr>
-      <w:proofErr w:type="spellStart"/>
       <w:r>
-        <w:t>Üks</w:t>
+        <w:t>Makstud arvet ei saa muuta</w:t>
       </w:r>
-      <w:proofErr w:type="spellEnd"/>
       <w:r>
-        <w:t xml:space="preserve"> </w:t>
+        <w:t>.</w:t>
       </w:r>
-      <w:proofErr w:type="spellStart"/>
+    </w:p>
+    <w:p>
+      <w:pPr>
+        <w:pStyle w:val="ListParagraph"/>
+        <w:numPr>
+          <w:ilvl w:val="0"/>
+          <w:numId w:val="1"/>
+        </w:numPr>
+      </w:pPr>
       <w:r>
-        <w:t>klient</w:t>
+        <w:t>Broneeringul kindel default kestvus, hetkel 30min</w:t>
       </w:r>
-      <w:proofErr w:type="spellEnd"/>
       <w:r>
-        <w:t xml:space="preserve"> </w:t>
+        <w:t>. Broneeringu kestvust saab pikemaks muuta vaid administrator ja seda järgnevate aegade arvelt ehk 30min saab muuta 1h-ks jne.</w:t>
       </w:r>
-      <w:proofErr w:type="spellStart"/>
-      <w:proofErr w:type="gramStart"/>
+    </w:p>
+    <w:p>
+      <w:pPr>
+        <w:pStyle w:val="ListParagraph"/>
+        <w:numPr>
+          <w:ilvl w:val="0"/>
+          <w:numId w:val="1"/>
+        </w:numPr>
+      </w:pPr>
       <w:r>
-        <w:t>saab</w:t>
+        <w:t>Üks klient saab ühe arsti juurde panna ühele päevale korraga ühe aja</w:t>
       </w:r>
-      <w:proofErr w:type="spellEnd"/>
-      <w:proofErr w:type="gramEnd"/>
-      <w:r>
-        <w:t xml:space="preserve"> </w:t>
-      </w:r>
-      <w:proofErr w:type="spellStart"/>
-      <w:r>
-        <w:t>ühe</w:t>
-      </w:r>
-      <w:proofErr w:type="spellEnd"/>
-      <w:r>
-        <w:t xml:space="preserve"> </w:t>
-      </w:r>
-      <w:proofErr w:type="spellStart"/>
-      <w:r>
-        <w:t>arsti</w:t>
-      </w:r>
-      <w:proofErr w:type="spellEnd"/>
-      <w:r>
-        <w:t xml:space="preserve"> </w:t>
-      </w:r>
-      <w:proofErr w:type="spellStart"/>
-      <w:r>
-        <w:t>juurde</w:t>
-      </w:r>
-      <w:proofErr w:type="spellEnd"/>
-      <w:r>
-        <w:t xml:space="preserve"> panna </w:t>
-      </w:r>
-      <w:proofErr w:type="spellStart"/>
-      <w:r>
-        <w:t>ühele</w:t>
-      </w:r>
-      <w:proofErr w:type="spellEnd"/>
-      <w:r>
-        <w:t xml:space="preserve"> </w:t>
-      </w:r>
-      <w:proofErr w:type="spellStart"/>
-      <w:r>
-        <w:t>päevale</w:t>
-      </w:r>
-      <w:proofErr w:type="spellEnd"/>
-      <w:r>
-        <w:t xml:space="preserve"> </w:t>
-      </w:r>
-      <w:proofErr w:type="spellStart"/>
-      <w:r>
-        <w:t>korraga</w:t>
-      </w:r>
-      <w:proofErr w:type="spellEnd"/>
-      <w:r>
-        <w:t xml:space="preserve"> </w:t>
-      </w:r>
-      <w:proofErr w:type="spellStart"/>
-      <w:r>
-        <w:t>ühe</w:t>
-      </w:r>
-      <w:proofErr w:type="spellEnd"/>
-      <w:r>
-        <w:t xml:space="preserve"> </w:t>
-      </w:r>
-      <w:proofErr w:type="spellStart"/>
-      <w:r>
-        <w:t>aja</w:t>
-      </w:r>
-      <w:proofErr w:type="spellEnd"/>
       <w:r>
         <w:t>.</w:t>
       </w:r>
@@ -8416,83 +7742,9 @@
           <w:numId w:val="2"/>
         </w:numPr>
       </w:pPr>
-      <w:proofErr w:type="spellStart"/>
       <w:r>
-        <w:t>Broneeringul</w:t>
+        <w:t>Broneeringul ajapiirang, kui mitu tundi enne on võimalik seda veel tühistada</w:t>
       </w:r>
-      <w:proofErr w:type="spellEnd"/>
-      <w:r>
-        <w:t xml:space="preserve"> </w:t>
-      </w:r>
-      <w:proofErr w:type="spellStart"/>
-      <w:r>
-        <w:t>ajapiirang</w:t>
-      </w:r>
-      <w:proofErr w:type="spellEnd"/>
-      <w:r>
-        <w:t xml:space="preserve">, </w:t>
-      </w:r>
-      <w:proofErr w:type="spellStart"/>
-      <w:r>
-        <w:t>kui</w:t>
-      </w:r>
-      <w:proofErr w:type="spellEnd"/>
-      <w:r>
-        <w:t xml:space="preserve"> </w:t>
-      </w:r>
-      <w:proofErr w:type="spellStart"/>
-      <w:r>
-        <w:t>mitu</w:t>
-      </w:r>
-      <w:proofErr w:type="spellEnd"/>
-      <w:r>
-        <w:t xml:space="preserve"> </w:t>
-      </w:r>
-      <w:proofErr w:type="spellStart"/>
-      <w:r>
-        <w:t>tundi</w:t>
-      </w:r>
-      <w:proofErr w:type="spellEnd"/>
-      <w:r>
-        <w:t xml:space="preserve"> </w:t>
-      </w:r>
-      <w:proofErr w:type="spellStart"/>
-      <w:r>
-        <w:t>enne</w:t>
-      </w:r>
-      <w:proofErr w:type="spellEnd"/>
-      <w:r>
-        <w:t xml:space="preserve"> on </w:t>
-      </w:r>
-      <w:proofErr w:type="spellStart"/>
-      <w:r>
-        <w:t>võimalik</w:t>
-      </w:r>
-      <w:proofErr w:type="spellEnd"/>
-      <w:r>
-        <w:t xml:space="preserve"> </w:t>
-      </w:r>
-      <w:proofErr w:type="spellStart"/>
-      <w:r>
-        <w:t>seda</w:t>
-      </w:r>
-      <w:proofErr w:type="spellEnd"/>
-      <w:r>
-        <w:t xml:space="preserve"> </w:t>
-      </w:r>
-      <w:proofErr w:type="spellStart"/>
-      <w:r>
-        <w:t>veel</w:t>
-      </w:r>
-      <w:proofErr w:type="spellEnd"/>
-      <w:r>
-        <w:t xml:space="preserve"> </w:t>
-      </w:r>
-      <w:proofErr w:type="spellStart"/>
-      <w:r>
-        <w:t>tühistada</w:t>
-      </w:r>
-      <w:proofErr w:type="spellEnd"/>
       <w:r>
         <w:t>.</w:t>
       </w:r>
@@ -8505,93 +7757,9 @@
           <w:numId w:val="2"/>
         </w:numPr>
       </w:pPr>
-      <w:proofErr w:type="spellStart"/>
       <w:r>
-        <w:t>Arvet</w:t>
+        <w:t>Arvet saab luua ainult Completed broneeringule, lisana v’ib olla automaatne trahviarve NoShow kliendile</w:t>
       </w:r>
-      <w:proofErr w:type="spellEnd"/>
-      <w:r>
-        <w:t xml:space="preserve"> </w:t>
-      </w:r>
-      <w:proofErr w:type="spellStart"/>
-      <w:proofErr w:type="gramStart"/>
-      <w:r>
-        <w:t>saab</w:t>
-      </w:r>
-      <w:proofErr w:type="spellEnd"/>
-      <w:proofErr w:type="gramEnd"/>
-      <w:r>
-        <w:t xml:space="preserve"> </w:t>
-      </w:r>
-      <w:proofErr w:type="spellStart"/>
-      <w:r>
-        <w:t>luua</w:t>
-      </w:r>
-      <w:proofErr w:type="spellEnd"/>
-      <w:r>
-        <w:t xml:space="preserve"> </w:t>
-      </w:r>
-      <w:proofErr w:type="spellStart"/>
-      <w:r>
-        <w:t>ainult</w:t>
-      </w:r>
-      <w:proofErr w:type="spellEnd"/>
-      <w:r>
-        <w:t xml:space="preserve"> Completed </w:t>
-      </w:r>
-      <w:proofErr w:type="spellStart"/>
-      <w:r>
-        <w:t>broneeringule</w:t>
-      </w:r>
-      <w:proofErr w:type="spellEnd"/>
-      <w:r>
-        <w:t xml:space="preserve">, </w:t>
-      </w:r>
-      <w:proofErr w:type="spellStart"/>
-      <w:r>
-        <w:t>lisana</w:t>
-      </w:r>
-      <w:proofErr w:type="spellEnd"/>
-      <w:r>
-        <w:t xml:space="preserve"> </w:t>
-      </w:r>
-      <w:proofErr w:type="spellStart"/>
-      <w:r>
-        <w:t>v’ib</w:t>
-      </w:r>
-      <w:proofErr w:type="spellEnd"/>
-      <w:r>
-        <w:t xml:space="preserve"> olla </w:t>
-      </w:r>
-      <w:proofErr w:type="spellStart"/>
-      <w:r>
-        <w:t>automaatne</w:t>
-      </w:r>
-      <w:proofErr w:type="spellEnd"/>
-      <w:r>
-        <w:t xml:space="preserve"> </w:t>
-      </w:r>
-      <w:proofErr w:type="spellStart"/>
-      <w:r>
-        <w:t>trahviarve</w:t>
-      </w:r>
-      <w:proofErr w:type="spellEnd"/>
-      <w:r>
-        <w:t xml:space="preserve"> </w:t>
-      </w:r>
-      <w:proofErr w:type="spellStart"/>
-      <w:r>
-        <w:t>NoShow</w:t>
-      </w:r>
-      <w:proofErr w:type="spellEnd"/>
-      <w:r>
-        <w:t xml:space="preserve"> </w:t>
-      </w:r>
-      <w:proofErr w:type="spellStart"/>
-      <w:r>
-        <w:t>kliendile</w:t>
-      </w:r>
-      <w:proofErr w:type="spellEnd"/>
       <w:r>
         <w:t>.</w:t>
       </w:r>
@@ -8604,55 +7772,8 @@
           <w:numId w:val="2"/>
         </w:numPr>
       </w:pPr>
-      <w:proofErr w:type="spellStart"/>
       <w:r>
-        <w:t>Dokumendi</w:t>
-      </w:r>
-      <w:proofErr w:type="spellEnd"/>
-      <w:r>
-        <w:t xml:space="preserve"> </w:t>
-      </w:r>
-      <w:proofErr w:type="spellStart"/>
-      <w:r>
-        <w:t>faili</w:t>
-      </w:r>
-      <w:proofErr w:type="spellEnd"/>
-      <w:r>
-        <w:t xml:space="preserve"> </w:t>
-      </w:r>
-      <w:proofErr w:type="spellStart"/>
-      <w:r>
-        <w:t>suurusele</w:t>
-      </w:r>
-      <w:proofErr w:type="spellEnd"/>
-      <w:r>
-        <w:t xml:space="preserve"> </w:t>
-      </w:r>
-      <w:proofErr w:type="spellStart"/>
-      <w:r>
-        <w:t>määrata</w:t>
-      </w:r>
-      <w:proofErr w:type="spellEnd"/>
-      <w:r>
-        <w:t xml:space="preserve"> max </w:t>
-      </w:r>
-      <w:proofErr w:type="spellStart"/>
-      <w:r>
-        <w:t>suurus</w:t>
-      </w:r>
-      <w:proofErr w:type="spellEnd"/>
-      <w:r>
-        <w:t xml:space="preserve">, </w:t>
-      </w:r>
-      <w:proofErr w:type="spellStart"/>
-      <w:proofErr w:type="gramStart"/>
-      <w:r>
-        <w:t>nt</w:t>
-      </w:r>
-      <w:proofErr w:type="spellEnd"/>
-      <w:proofErr w:type="gramEnd"/>
-      <w:r>
-        <w:t xml:space="preserve"> 10MB fail</w:t>
+        <w:t>Dokumendi faili suurusele määrata max suurus, nt 10MB fail</w:t>
       </w:r>
       <w:r>
         <w:t>.</w:t>
@@ -8771,167 +7892,8 @@
           <w:numId w:val="4"/>
         </w:numPr>
       </w:pPr>
-      <w:proofErr w:type="spellStart"/>
       <w:r>
-        <w:t>Klient</w:t>
-      </w:r>
-      <w:proofErr w:type="spellEnd"/>
-      <w:r>
-        <w:t xml:space="preserve"> </w:t>
-      </w:r>
-      <w:proofErr w:type="spellStart"/>
-      <w:r>
-        <w:t>näeb</w:t>
-      </w:r>
-      <w:proofErr w:type="spellEnd"/>
-      <w:r>
-        <w:t xml:space="preserve"> </w:t>
-      </w:r>
-      <w:proofErr w:type="spellStart"/>
-      <w:r>
-        <w:t>ainult</w:t>
-      </w:r>
-      <w:proofErr w:type="spellEnd"/>
-      <w:r>
-        <w:t xml:space="preserve"> </w:t>
-      </w:r>
-      <w:proofErr w:type="spellStart"/>
-      <w:r>
-        <w:t>oma</w:t>
-      </w:r>
-      <w:proofErr w:type="spellEnd"/>
-      <w:r>
-        <w:t xml:space="preserve"> </w:t>
-      </w:r>
-      <w:proofErr w:type="spellStart"/>
-      <w:r>
-        <w:t>andmeid</w:t>
-      </w:r>
-      <w:proofErr w:type="spellEnd"/>
-      <w:r>
-        <w:t xml:space="preserve">. </w:t>
-      </w:r>
-    </w:p>
-    <w:p>
-      <w:pPr>
-        <w:pStyle w:val="ListParagraph"/>
-        <w:numPr>
-          <w:ilvl w:val="0"/>
-          <w:numId w:val="4"/>
-        </w:numPr>
-      </w:pPr>
-      <w:proofErr w:type="spellStart"/>
-      <w:r>
-        <w:t>Broneeringu</w:t>
-      </w:r>
-      <w:proofErr w:type="spellEnd"/>
-      <w:r>
-        <w:t xml:space="preserve"> </w:t>
-      </w:r>
-      <w:proofErr w:type="spellStart"/>
-      <w:r>
-        <w:t>süsteemis</w:t>
-      </w:r>
-      <w:proofErr w:type="spellEnd"/>
-      <w:r>
-        <w:t xml:space="preserve"> on </w:t>
-      </w:r>
-      <w:proofErr w:type="spellStart"/>
-      <w:r>
-        <w:t>mitte-saadava</w:t>
-      </w:r>
-      <w:proofErr w:type="spellEnd"/>
-      <w:r>
-        <w:t xml:space="preserve"> </w:t>
-      </w:r>
-      <w:proofErr w:type="spellStart"/>
-      <w:r>
-        <w:t>ajad</w:t>
-      </w:r>
-      <w:proofErr w:type="spellEnd"/>
-      <w:r>
-        <w:t xml:space="preserve"> </w:t>
-      </w:r>
-      <w:proofErr w:type="spellStart"/>
-      <w:r>
-        <w:t>valiku</w:t>
-      </w:r>
-      <w:proofErr w:type="spellEnd"/>
-      <w:r>
-        <w:t xml:space="preserve"> </w:t>
-      </w:r>
-      <w:proofErr w:type="spellStart"/>
-      <w:r>
-        <w:t>osas</w:t>
-      </w:r>
-      <w:proofErr w:type="spellEnd"/>
-      <w:r>
-        <w:t xml:space="preserve"> </w:t>
-      </w:r>
-      <w:proofErr w:type="spellStart"/>
-      <w:r>
-        <w:t>lihtsalt</w:t>
-      </w:r>
-      <w:proofErr w:type="spellEnd"/>
-      <w:r>
-        <w:t xml:space="preserve"> </w:t>
-      </w:r>
-      <w:proofErr w:type="spellStart"/>
-      <w:r>
-        <w:t>inaktiivsed</w:t>
-      </w:r>
-      <w:proofErr w:type="spellEnd"/>
-      <w:r>
-        <w:t>.</w:t>
-      </w:r>
-    </w:p>
-    <w:p>
-      <w:pPr>
-        <w:pStyle w:val="ListParagraph"/>
-        <w:numPr>
-          <w:ilvl w:val="0"/>
-          <w:numId w:val="4"/>
-        </w:numPr>
-      </w:pPr>
-      <w:proofErr w:type="spellStart"/>
-      <w:r>
-        <w:t>Arst</w:t>
-      </w:r>
-      <w:proofErr w:type="spellEnd"/>
-      <w:r>
-        <w:t xml:space="preserve"> </w:t>
-      </w:r>
-      <w:proofErr w:type="spellStart"/>
-      <w:r>
-        <w:t>näeb</w:t>
-      </w:r>
-      <w:proofErr w:type="spellEnd"/>
-      <w:r>
-        <w:t xml:space="preserve"> </w:t>
-      </w:r>
-      <w:proofErr w:type="spellStart"/>
-      <w:r>
-        <w:t>ainult</w:t>
-      </w:r>
-      <w:proofErr w:type="spellEnd"/>
-      <w:r>
-        <w:t xml:space="preserve"> </w:t>
-      </w:r>
-      <w:proofErr w:type="spellStart"/>
-      <w:r>
-        <w:t>oma</w:t>
-      </w:r>
-      <w:proofErr w:type="spellEnd"/>
-      <w:r>
-        <w:t xml:space="preserve"> </w:t>
-      </w:r>
-      <w:proofErr w:type="spellStart"/>
-      <w:r>
-        <w:t>patsiente</w:t>
-      </w:r>
-      <w:proofErr w:type="spellEnd"/>
-      <w:r>
-        <w:t>.</w:t>
+        <w:t xml:space="preserve">Klient näeb ainult oma andmeid. </w:t>
       </w:r>
     </w:p>
     <w:p>
@@ -8943,23 +7905,7 @@
         </w:numPr>
       </w:pPr>
       <w:r>
-        <w:t xml:space="preserve">Admin </w:t>
-      </w:r>
-      <w:proofErr w:type="spellStart"/>
-      <w:r>
-        <w:t>näeb</w:t>
-      </w:r>
-      <w:proofErr w:type="spellEnd"/>
-      <w:r>
-        <w:t xml:space="preserve"> </w:t>
-      </w:r>
-      <w:proofErr w:type="spellStart"/>
-      <w:r>
-        <w:t>kõike</w:t>
-      </w:r>
-      <w:proofErr w:type="spellEnd"/>
-      <w:r>
-        <w:t>.</w:t>
+        <w:t>Broneeringu süsteemis on mitte-saadava ajad valiku osas lihtsalt inaktiivsed.</w:t>
       </w:r>
     </w:p>
     <w:p>
@@ -8970,27 +7916,34 @@
           <w:numId w:val="4"/>
         </w:numPr>
       </w:pPr>
-      <w:proofErr w:type="spellStart"/>
       <w:r>
-        <w:t>Paroolid</w:t>
+        <w:t>Arst näeb ainult oma patsiente.</w:t>
       </w:r>
-      <w:proofErr w:type="spellEnd"/>
+    </w:p>
+    <w:p>
+      <w:pPr>
+        <w:pStyle w:val="ListParagraph"/>
+        <w:numPr>
+          <w:ilvl w:val="0"/>
+          <w:numId w:val="4"/>
+        </w:numPr>
+      </w:pPr>
       <w:r>
-        <w:t xml:space="preserve"> </w:t>
+        <w:t>Admin näeb kõike.</w:t>
       </w:r>
-      <w:proofErr w:type="spellStart"/>
+    </w:p>
+    <w:p>
+      <w:pPr>
+        <w:pStyle w:val="ListParagraph"/>
+        <w:numPr>
+          <w:ilvl w:val="0"/>
+          <w:numId w:val="4"/>
+        </w:numPr>
+      </w:pPr>
       <w:r>
-        <w:t>ainult</w:t>
+        <w:lastRenderedPageBreak/>
+        <w:t>Paroolid ainult hash-itult</w:t>
       </w:r>
-      <w:proofErr w:type="spellEnd"/>
-      <w:r>
-        <w:t xml:space="preserve"> hash-</w:t>
-      </w:r>
-      <w:proofErr w:type="spellStart"/>
-      <w:r>
-        <w:t>itult</w:t>
-      </w:r>
-      <w:proofErr w:type="spellEnd"/>
     </w:p>
     <w:p>
       <w:pPr>

</xml_diff>